<commit_message>
Update ITP4523M Group Project Phase 1 File List (AY2526).docx
</commit_message>
<xml_diff>
--- a/ITP4523M Group Project (2025-2026)(for students)/ITP4523M Group Project Phase 1 File List (AY2526).docx
+++ b/ITP4523M Group Project (2025-2026)(for students)/ITP4523M Group Project Phase 1 File List (AY2526).docx
@@ -1,6 +1,6 @@
 
 <file path=word/document.xml><?xml version="1.0" encoding="utf-8"?>
-<w:document xmlns:wpc="http://schemas.microsoft.com/office/word/2010/wordprocessingCanvas" xmlns:cx="http://schemas.microsoft.com/office/drawing/2014/chartex" xmlns:cx1="http://schemas.microsoft.com/office/drawing/2015/9/8/chartex" xmlns:cx2="http://schemas.microsoft.com/office/drawing/2015/10/21/chartex" xmlns:cx3="http://schemas.microsoft.com/office/drawing/2016/5/9/chartex" xmlns:cx4="http://schemas.microsoft.com/office/drawing/2016/5/10/chartex" xmlns:cx5="http://schemas.microsoft.com/office/drawing/2016/5/11/chartex" xmlns:cx6="http://schemas.microsoft.com/office/drawing/2016/5/12/chartex" xmlns:cx7="http://schemas.microsoft.com/office/drawing/2016/5/13/chartex" xmlns:cx8="http://schemas.microsoft.com/office/drawing/2016/5/14/chartex" xmlns:mc="http://schemas.openxmlformats.org/markup-compatibility/2006" xmlns:aink="http://schemas.microsoft.com/office/drawing/2016/ink" xmlns:am3d="http://schemas.microsoft.com/office/drawing/2017/model3d" xmlns:o="urn:schemas-microsoft-com:office:office" xmlns:oel="http://schemas.microsoft.com/office/2019/extlst" xmlns:r="http://schemas.openxmlformats.org/officeDocument/2006/relationships" xmlns:m="http://schemas.openxmlformats.org/officeDocument/2006/math" xmlns:v="urn:schemas-microsoft-com:vml" xmlns:wp14="http://schemas.microsoft.com/office/word/2010/wordprocessingDrawing" xmlns:wp="http://schemas.openxmlformats.org/drawingml/2006/wordprocessingDrawing" xmlns:w10="urn:schemas-microsoft-com:office:word" xmlns:w="http://schemas.openxmlformats.org/wordprocessingml/2006/main" xmlns:w14="http://schemas.microsoft.com/office/word/2010/wordml" xmlns:w15="http://schemas.microsoft.com/office/word/2012/wordml" xmlns:w16cex="http://schemas.microsoft.com/office/word/2018/wordml/cex" xmlns:w16cid="http://schemas.microsoft.com/office/word/2016/wordml/cid" xmlns:w16="http://schemas.microsoft.com/office/word/2018/wordml" xmlns:w16sdtdh="http://schemas.microsoft.com/office/word/2020/wordml/sdtdatahash" xmlns:w16se="http://schemas.microsoft.com/office/word/2015/wordml/symex" xmlns:wpg="http://schemas.microsoft.com/office/word/2010/wordprocessingGroup" xmlns:wpi="http://schemas.microsoft.com/office/word/2010/wordprocessingInk" xmlns:wne="http://schemas.microsoft.com/office/word/2006/wordml" xmlns:wps="http://schemas.microsoft.com/office/word/2010/wordprocessingShape" mc:Ignorable="w14 w15 w16se w16cid w16 w16cex w16sdtdh wp14">
+<w:document xmlns:wpc="http://schemas.microsoft.com/office/word/2010/wordprocessingCanvas" xmlns:cx="http://schemas.microsoft.com/office/drawing/2014/chartex" xmlns:cx1="http://schemas.microsoft.com/office/drawing/2015/9/8/chartex" xmlns:cx2="http://schemas.microsoft.com/office/drawing/2015/10/21/chartex" xmlns:cx3="http://schemas.microsoft.com/office/drawing/2016/5/9/chartex" xmlns:cx4="http://schemas.microsoft.com/office/drawing/2016/5/10/chartex" xmlns:cx5="http://schemas.microsoft.com/office/drawing/2016/5/11/chartex" xmlns:cx6="http://schemas.microsoft.com/office/drawing/2016/5/12/chartex" xmlns:cx7="http://schemas.microsoft.com/office/drawing/2016/5/13/chartex" xmlns:cx8="http://schemas.microsoft.com/office/drawing/2016/5/14/chartex" xmlns:mc="http://schemas.openxmlformats.org/markup-compatibility/2006" xmlns:aink="http://schemas.microsoft.com/office/drawing/2016/ink" xmlns:am3d="http://schemas.microsoft.com/office/drawing/2017/model3d" xmlns:o="urn:schemas-microsoft-com:office:office" xmlns:r="http://schemas.openxmlformats.org/officeDocument/2006/relationships" xmlns:m="http://schemas.openxmlformats.org/officeDocument/2006/math" xmlns:v="urn:schemas-microsoft-com:vml" xmlns:wp14="http://schemas.microsoft.com/office/word/2010/wordprocessingDrawing" xmlns:wp="http://schemas.openxmlformats.org/drawingml/2006/wordprocessingDrawing" xmlns:w10="urn:schemas-microsoft-com:office:word" xmlns:w="http://schemas.openxmlformats.org/wordprocessingml/2006/main" xmlns:w14="http://schemas.microsoft.com/office/word/2010/wordml" xmlns:w15="http://schemas.microsoft.com/office/word/2012/wordml" xmlns:w16cid="http://schemas.microsoft.com/office/word/2016/wordml/cid" xmlns:w16se="http://schemas.microsoft.com/office/word/2015/wordml/symex" xmlns:wpg="http://schemas.microsoft.com/office/word/2010/wordprocessingGroup" xmlns:wpi="http://schemas.microsoft.com/office/word/2010/wordprocessingInk" xmlns:wne="http://schemas.microsoft.com/office/word/2006/wordml" xmlns:wps="http://schemas.microsoft.com/office/word/2010/wordprocessingShape" mc:Ignorable="w14 w15 w16se w16cid wp14">
   <w:body>
     <w:p>
       <w:pPr>
@@ -304,6 +304,7 @@
         </w:rPr>
         <w:t xml:space="preserve"> or </w:t>
       </w:r>
+      <w:proofErr w:type="spellStart"/>
       <w:r>
         <w:rPr>
           <w:rFonts w:ascii="Palatino Linotype" w:hAnsi="Palatino Linotype"/>
@@ -311,6 +312,7 @@
         </w:rPr>
         <w:t>index.php</w:t>
       </w:r>
+      <w:proofErr w:type="spellEnd"/>
     </w:p>
     <w:p>
       <w:pPr>
@@ -429,7 +431,7 @@
         <w:tc>
           <w:tcPr>
             <w:cnfStyle w:val="001000000000" w:firstRow="0" w:lastRow="0" w:firstColumn="1" w:lastColumn="0" w:oddVBand="0" w:evenVBand="0" w:oddHBand="0" w:evenHBand="0" w:firstRowFirstColumn="0" w:firstRowLastColumn="0" w:lastRowFirstColumn="0" w:lastRowLastColumn="0"/>
-            <w:tcW w:w="985" w:type="dxa"/>
+            <w:tcW w:w="1213" w:type="dxa"/>
             <w:vAlign w:val="center"/>
           </w:tcPr>
           <w:p>
@@ -450,7 +452,7 @@
         </w:tc>
         <w:tc>
           <w:tcPr>
-            <w:tcW w:w="8032" w:type="dxa"/>
+            <w:tcW w:w="7804" w:type="dxa"/>
             <w:vAlign w:val="center"/>
           </w:tcPr>
           <w:p>
@@ -497,7 +499,7 @@
         <w:tc>
           <w:tcPr>
             <w:cnfStyle w:val="001000000000" w:firstRow="0" w:lastRow="0" w:firstColumn="1" w:lastColumn="0" w:oddVBand="0" w:evenVBand="0" w:oddHBand="0" w:evenHBand="0" w:firstRowFirstColumn="0" w:firstRowLastColumn="0" w:lastRowFirstColumn="0" w:lastRowLastColumn="0"/>
-            <w:tcW w:w="985" w:type="dxa"/>
+            <w:tcW w:w="1213" w:type="dxa"/>
             <w:vAlign w:val="center"/>
           </w:tcPr>
           <w:p>
@@ -523,8 +525,7 @@
         </w:tc>
         <w:tc>
           <w:tcPr>
-            <w:tcW w:w="8032" w:type="dxa"/>
-            <w:vAlign w:val="center"/>
+            <w:tcW w:w="7804" w:type="dxa"/>
           </w:tcPr>
           <w:p>
             <w:pPr>
@@ -533,14 +534,17 @@
                 <w:rFonts w:ascii="Consolas" w:hAnsi="Consolas"/>
               </w:rPr>
             </w:pPr>
-          </w:p>
-        </w:tc>
-      </w:tr>
-      <w:tr>
-        <w:tc>
-          <w:tcPr>
-            <w:cnfStyle w:val="001000000000" w:firstRow="0" w:lastRow="0" w:firstColumn="1" w:lastColumn="0" w:oddVBand="0" w:evenVBand="0" w:oddHBand="0" w:evenHBand="0" w:firstRowFirstColumn="0" w:firstRowLastColumn="0" w:lastRowFirstColumn="0" w:lastRowLastColumn="0"/>
-            <w:tcW w:w="985" w:type="dxa"/>
+            <w:r>
+              <w:t>index.html</w:t>
+            </w:r>
+          </w:p>
+        </w:tc>
+      </w:tr>
+      <w:tr>
+        <w:tc>
+          <w:tcPr>
+            <w:cnfStyle w:val="001000000000" w:firstRow="0" w:lastRow="0" w:firstColumn="1" w:lastColumn="0" w:oddVBand="0" w:evenVBand="0" w:oddHBand="0" w:evenHBand="0" w:firstRowFirstColumn="0" w:firstRowLastColumn="0" w:lastRowFirstColumn="0" w:lastRowLastColumn="0"/>
+            <w:tcW w:w="1213" w:type="dxa"/>
             <w:vAlign w:val="center"/>
           </w:tcPr>
           <w:p>
@@ -566,8 +570,7 @@
         </w:tc>
         <w:tc>
           <w:tcPr>
-            <w:tcW w:w="8032" w:type="dxa"/>
-            <w:vAlign w:val="center"/>
+            <w:tcW w:w="7804" w:type="dxa"/>
           </w:tcPr>
           <w:p>
             <w:pPr>
@@ -576,6 +579,9 @@
                 <w:rFonts w:ascii="Consolas" w:hAnsi="Consolas"/>
               </w:rPr>
             </w:pPr>
+            <w:r>
+              <w:t>product-details.html</w:t>
+            </w:r>
           </w:p>
         </w:tc>
       </w:tr>
@@ -586,7 +592,7 @@
         <w:tc>
           <w:tcPr>
             <w:cnfStyle w:val="001000000000" w:firstRow="0" w:lastRow="0" w:firstColumn="1" w:lastColumn="0" w:oddVBand="0" w:evenVBand="0" w:oddHBand="0" w:evenHBand="0" w:firstRowFirstColumn="0" w:firstRowLastColumn="0" w:lastRowFirstColumn="0" w:lastRowLastColumn="0"/>
-            <w:tcW w:w="985" w:type="dxa"/>
+            <w:tcW w:w="1213" w:type="dxa"/>
             <w:vAlign w:val="center"/>
           </w:tcPr>
           <w:p>
@@ -612,8 +618,7 @@
         </w:tc>
         <w:tc>
           <w:tcPr>
-            <w:tcW w:w="8032" w:type="dxa"/>
-            <w:vAlign w:val="center"/>
+            <w:tcW w:w="7804" w:type="dxa"/>
           </w:tcPr>
           <w:p>
             <w:pPr>
@@ -622,14 +627,17 @@
                 <w:rFonts w:ascii="Consolas" w:hAnsi="Consolas"/>
               </w:rPr>
             </w:pPr>
-          </w:p>
-        </w:tc>
-      </w:tr>
-      <w:tr>
-        <w:tc>
-          <w:tcPr>
-            <w:cnfStyle w:val="001000000000" w:firstRow="0" w:lastRow="0" w:firstColumn="1" w:lastColumn="0" w:oddVBand="0" w:evenVBand="0" w:oddHBand="0" w:evenHBand="0" w:firstRowFirstColumn="0" w:firstRowLastColumn="0" w:lastRowFirstColumn="0" w:lastRowLastColumn="0"/>
-            <w:tcW w:w="985" w:type="dxa"/>
+            <w:r>
+              <w:t>shopping-cart.html</w:t>
+            </w:r>
+          </w:p>
+        </w:tc>
+      </w:tr>
+      <w:tr>
+        <w:tc>
+          <w:tcPr>
+            <w:cnfStyle w:val="001000000000" w:firstRow="0" w:lastRow="0" w:firstColumn="1" w:lastColumn="0" w:oddVBand="0" w:evenVBand="0" w:oddHBand="0" w:evenHBand="0" w:firstRowFirstColumn="0" w:firstRowLastColumn="0" w:lastRowFirstColumn="0" w:lastRowLastColumn="0"/>
+            <w:tcW w:w="1213" w:type="dxa"/>
             <w:vAlign w:val="center"/>
           </w:tcPr>
           <w:p>
@@ -655,8 +663,7 @@
         </w:tc>
         <w:tc>
           <w:tcPr>
-            <w:tcW w:w="8032" w:type="dxa"/>
-            <w:vAlign w:val="center"/>
+            <w:tcW w:w="7804" w:type="dxa"/>
           </w:tcPr>
           <w:p>
             <w:pPr>
@@ -665,6 +672,9 @@
                 <w:rFonts w:ascii="Consolas" w:hAnsi="Consolas"/>
               </w:rPr>
             </w:pPr>
+            <w:r>
+              <w:t>checkout.html</w:t>
+            </w:r>
           </w:p>
         </w:tc>
       </w:tr>
@@ -675,7 +685,7 @@
         <w:tc>
           <w:tcPr>
             <w:cnfStyle w:val="001000000000" w:firstRow="0" w:lastRow="0" w:firstColumn="1" w:lastColumn="0" w:oddVBand="0" w:evenVBand="0" w:oddHBand="0" w:evenHBand="0" w:firstRowFirstColumn="0" w:firstRowLastColumn="0" w:lastRowFirstColumn="0" w:lastRowLastColumn="0"/>
-            <w:tcW w:w="985" w:type="dxa"/>
+            <w:tcW w:w="1213" w:type="dxa"/>
             <w:vAlign w:val="center"/>
           </w:tcPr>
           <w:p>
@@ -701,8 +711,7 @@
         </w:tc>
         <w:tc>
           <w:tcPr>
-            <w:tcW w:w="8032" w:type="dxa"/>
-            <w:vAlign w:val="center"/>
+            <w:tcW w:w="7804" w:type="dxa"/>
           </w:tcPr>
           <w:p>
             <w:pPr>
@@ -711,14 +720,17 @@
                 <w:rFonts w:ascii="Consolas" w:hAnsi="Consolas"/>
               </w:rPr>
             </w:pPr>
-          </w:p>
-        </w:tc>
-      </w:tr>
-      <w:tr>
-        <w:tc>
-          <w:tcPr>
-            <w:cnfStyle w:val="001000000000" w:firstRow="0" w:lastRow="0" w:firstColumn="1" w:lastColumn="0" w:oddVBand="0" w:evenVBand="0" w:oddHBand="0" w:evenHBand="0" w:firstRowFirstColumn="0" w:firstRowLastColumn="0" w:lastRowFirstColumn="0" w:lastRowLastColumn="0"/>
-            <w:tcW w:w="985" w:type="dxa"/>
+            <w:r>
+              <w:t>order-summary.html</w:t>
+            </w:r>
+          </w:p>
+        </w:tc>
+      </w:tr>
+      <w:tr>
+        <w:tc>
+          <w:tcPr>
+            <w:cnfStyle w:val="001000000000" w:firstRow="0" w:lastRow="0" w:firstColumn="1" w:lastColumn="0" w:oddVBand="0" w:evenVBand="0" w:oddHBand="0" w:evenHBand="0" w:firstRowFirstColumn="0" w:firstRowLastColumn="0" w:lastRowFirstColumn="0" w:lastRowLastColumn="0"/>
+            <w:tcW w:w="1213" w:type="dxa"/>
             <w:vAlign w:val="center"/>
           </w:tcPr>
           <w:p>
@@ -744,8 +756,7 @@
         </w:tc>
         <w:tc>
           <w:tcPr>
-            <w:tcW w:w="8032" w:type="dxa"/>
-            <w:vAlign w:val="center"/>
+            <w:tcW w:w="7804" w:type="dxa"/>
           </w:tcPr>
           <w:p>
             <w:pPr>
@@ -754,6 +765,9 @@
                 <w:rFonts w:ascii="Consolas" w:hAnsi="Consolas"/>
               </w:rPr>
             </w:pPr>
+            <w:r>
+              <w:t>order-confirmation.html</w:t>
+            </w:r>
           </w:p>
         </w:tc>
       </w:tr>
@@ -764,7 +778,7 @@
         <w:tc>
           <w:tcPr>
             <w:cnfStyle w:val="001000000000" w:firstRow="0" w:lastRow="0" w:firstColumn="1" w:lastColumn="0" w:oddVBand="0" w:evenVBand="0" w:oddHBand="0" w:evenHBand="0" w:firstRowFirstColumn="0" w:firstRowLastColumn="0" w:lastRowFirstColumn="0" w:lastRowLastColumn="0"/>
-            <w:tcW w:w="985" w:type="dxa"/>
+            <w:tcW w:w="1213" w:type="dxa"/>
             <w:vAlign w:val="center"/>
           </w:tcPr>
           <w:p>
@@ -790,8 +804,7 @@
         </w:tc>
         <w:tc>
           <w:tcPr>
-            <w:tcW w:w="8032" w:type="dxa"/>
-            <w:vAlign w:val="center"/>
+            <w:tcW w:w="7804" w:type="dxa"/>
           </w:tcPr>
           <w:p>
             <w:pPr>
@@ -800,6 +813,9 @@
                 <w:rFonts w:ascii="Consolas" w:hAnsi="Consolas"/>
               </w:rPr>
             </w:pPr>
+            <w:r>
+              <w:t>custom-furniture.html</w:t>
+            </w:r>
           </w:p>
         </w:tc>
       </w:tr>
@@ -850,7 +866,7 @@
         <w:tc>
           <w:tcPr>
             <w:cnfStyle w:val="001000000000" w:firstRow="0" w:lastRow="0" w:firstColumn="1" w:lastColumn="0" w:oddVBand="0" w:evenVBand="0" w:oddHBand="0" w:evenHBand="0" w:firstRowFirstColumn="0" w:firstRowLastColumn="0" w:lastRowFirstColumn="0" w:lastRowLastColumn="0"/>
-            <w:tcW w:w="985" w:type="dxa"/>
+            <w:tcW w:w="1213" w:type="dxa"/>
             <w:vAlign w:val="center"/>
           </w:tcPr>
           <w:p>
@@ -871,7 +887,7 @@
         </w:tc>
         <w:tc>
           <w:tcPr>
-            <w:tcW w:w="8032" w:type="dxa"/>
+            <w:tcW w:w="7804" w:type="dxa"/>
             <w:vAlign w:val="center"/>
           </w:tcPr>
           <w:p>
@@ -899,7 +915,7 @@
         <w:tc>
           <w:tcPr>
             <w:cnfStyle w:val="001000000000" w:firstRow="0" w:lastRow="0" w:firstColumn="1" w:lastColumn="0" w:oddVBand="0" w:evenVBand="0" w:oddHBand="0" w:evenHBand="0" w:firstRowFirstColumn="0" w:firstRowLastColumn="0" w:lastRowFirstColumn="0" w:lastRowLastColumn="0"/>
-            <w:tcW w:w="985" w:type="dxa"/>
+            <w:tcW w:w="1213" w:type="dxa"/>
             <w:vAlign w:val="center"/>
           </w:tcPr>
           <w:p>
@@ -925,8 +941,7 @@
         </w:tc>
         <w:tc>
           <w:tcPr>
-            <w:tcW w:w="8032" w:type="dxa"/>
-            <w:vAlign w:val="center"/>
+            <w:tcW w:w="7804" w:type="dxa"/>
           </w:tcPr>
           <w:p>
             <w:pPr>
@@ -935,14 +950,17 @@
                 <w:rFonts w:ascii="Consolas" w:hAnsi="Consolas"/>
               </w:rPr>
             </w:pPr>
-          </w:p>
-        </w:tc>
-      </w:tr>
-      <w:tr>
-        <w:tc>
-          <w:tcPr>
-            <w:cnfStyle w:val="001000000000" w:firstRow="0" w:lastRow="0" w:firstColumn="1" w:lastColumn="0" w:oddVBand="0" w:evenVBand="0" w:oddHBand="0" w:evenHBand="0" w:firstRowFirstColumn="0" w:firstRowLastColumn="0" w:lastRowFirstColumn="0" w:lastRowLastColumn="0"/>
-            <w:tcW w:w="985" w:type="dxa"/>
+            <w:r>
+              <w:t>customer-login.html</w:t>
+            </w:r>
+          </w:p>
+        </w:tc>
+      </w:tr>
+      <w:tr>
+        <w:tc>
+          <w:tcPr>
+            <w:cnfStyle w:val="001000000000" w:firstRow="0" w:lastRow="0" w:firstColumn="1" w:lastColumn="0" w:oddVBand="0" w:evenVBand="0" w:oddHBand="0" w:evenHBand="0" w:firstRowFirstColumn="0" w:firstRowLastColumn="0" w:lastRowFirstColumn="0" w:lastRowLastColumn="0"/>
+            <w:tcW w:w="1213" w:type="dxa"/>
             <w:vAlign w:val="center"/>
           </w:tcPr>
           <w:p>
@@ -968,8 +986,7 @@
         </w:tc>
         <w:tc>
           <w:tcPr>
-            <w:tcW w:w="8032" w:type="dxa"/>
-            <w:vAlign w:val="center"/>
+            <w:tcW w:w="7804" w:type="dxa"/>
           </w:tcPr>
           <w:p>
             <w:pPr>
@@ -978,6 +995,9 @@
                 <w:rFonts w:ascii="Consolas" w:hAnsi="Consolas"/>
               </w:rPr>
             </w:pPr>
+            <w:r>
+              <w:t>customer-dashboard.html</w:t>
+            </w:r>
           </w:p>
         </w:tc>
       </w:tr>
@@ -988,7 +1008,7 @@
         <w:tc>
           <w:tcPr>
             <w:cnfStyle w:val="001000000000" w:firstRow="0" w:lastRow="0" w:firstColumn="1" w:lastColumn="0" w:oddVBand="0" w:evenVBand="0" w:oddHBand="0" w:evenHBand="0" w:firstRowFirstColumn="0" w:firstRowLastColumn="0" w:lastRowFirstColumn="0" w:lastRowLastColumn="0"/>
-            <w:tcW w:w="985" w:type="dxa"/>
+            <w:tcW w:w="1213" w:type="dxa"/>
             <w:vAlign w:val="center"/>
           </w:tcPr>
           <w:p>
@@ -1014,8 +1034,7 @@
         </w:tc>
         <w:tc>
           <w:tcPr>
-            <w:tcW w:w="8032" w:type="dxa"/>
-            <w:vAlign w:val="center"/>
+            <w:tcW w:w="7804" w:type="dxa"/>
           </w:tcPr>
           <w:p>
             <w:pPr>
@@ -1024,14 +1043,17 @@
                 <w:rFonts w:ascii="Consolas" w:hAnsi="Consolas"/>
               </w:rPr>
             </w:pPr>
-          </w:p>
-        </w:tc>
-      </w:tr>
-      <w:tr>
-        <w:tc>
-          <w:tcPr>
-            <w:cnfStyle w:val="001000000000" w:firstRow="0" w:lastRow="0" w:firstColumn="1" w:lastColumn="0" w:oddVBand="0" w:evenVBand="0" w:oddHBand="0" w:evenHBand="0" w:firstRowFirstColumn="0" w:firstRowLastColumn="0" w:lastRowFirstColumn="0" w:lastRowLastColumn="0"/>
-            <w:tcW w:w="985" w:type="dxa"/>
+            <w:r>
+              <w:t>order-history.html</w:t>
+            </w:r>
+          </w:p>
+        </w:tc>
+      </w:tr>
+      <w:tr>
+        <w:tc>
+          <w:tcPr>
+            <w:cnfStyle w:val="001000000000" w:firstRow="0" w:lastRow="0" w:firstColumn="1" w:lastColumn="0" w:oddVBand="0" w:evenVBand="0" w:oddHBand="0" w:evenHBand="0" w:firstRowFirstColumn="0" w:firstRowLastColumn="0" w:lastRowFirstColumn="0" w:lastRowLastColumn="0"/>
+            <w:tcW w:w="1213" w:type="dxa"/>
             <w:vAlign w:val="center"/>
           </w:tcPr>
           <w:p>
@@ -1057,8 +1079,7 @@
         </w:tc>
         <w:tc>
           <w:tcPr>
-            <w:tcW w:w="8032" w:type="dxa"/>
-            <w:vAlign w:val="center"/>
+            <w:tcW w:w="7804" w:type="dxa"/>
           </w:tcPr>
           <w:p>
             <w:pPr>
@@ -1067,6 +1088,9 @@
                 <w:rFonts w:ascii="Consolas" w:hAnsi="Consolas"/>
               </w:rPr>
             </w:pPr>
+            <w:r>
+              <w:t>order-details.html</w:t>
+            </w:r>
           </w:p>
         </w:tc>
       </w:tr>
@@ -1077,7 +1101,7 @@
         <w:tc>
           <w:tcPr>
             <w:cnfStyle w:val="001000000000" w:firstRow="0" w:lastRow="0" w:firstColumn="1" w:lastColumn="0" w:oddVBand="0" w:evenVBand="0" w:oddHBand="0" w:evenHBand="0" w:firstRowFirstColumn="0" w:firstRowLastColumn="0" w:lastRowFirstColumn="0" w:lastRowLastColumn="0"/>
-            <w:tcW w:w="985" w:type="dxa"/>
+            <w:tcW w:w="1213" w:type="dxa"/>
             <w:vAlign w:val="center"/>
           </w:tcPr>
           <w:p>
@@ -1103,8 +1127,7 @@
         </w:tc>
         <w:tc>
           <w:tcPr>
-            <w:tcW w:w="8032" w:type="dxa"/>
-            <w:vAlign w:val="center"/>
+            <w:tcW w:w="7804" w:type="dxa"/>
           </w:tcPr>
           <w:p>
             <w:pPr>
@@ -1113,14 +1136,17 @@
                 <w:rFonts w:ascii="Consolas" w:hAnsi="Consolas"/>
               </w:rPr>
             </w:pPr>
-          </w:p>
-        </w:tc>
-      </w:tr>
-      <w:tr>
-        <w:tc>
-          <w:tcPr>
-            <w:cnfStyle w:val="001000000000" w:firstRow="0" w:lastRow="0" w:firstColumn="1" w:lastColumn="0" w:oddVBand="0" w:evenVBand="0" w:oddHBand="0" w:evenHBand="0" w:firstRowFirstColumn="0" w:firstRowLastColumn="0" w:lastRowFirstColumn="0" w:lastRowLastColumn="0"/>
-            <w:tcW w:w="985" w:type="dxa"/>
+            <w:r>
+              <w:t>order-tracking.html</w:t>
+            </w:r>
+          </w:p>
+        </w:tc>
+      </w:tr>
+      <w:tr>
+        <w:tc>
+          <w:tcPr>
+            <w:cnfStyle w:val="001000000000" w:firstRow="0" w:lastRow="0" w:firstColumn="1" w:lastColumn="0" w:oddVBand="0" w:evenVBand="0" w:oddHBand="0" w:evenHBand="0" w:firstRowFirstColumn="0" w:firstRowLastColumn="0" w:lastRowFirstColumn="0" w:lastRowLastColumn="0"/>
+            <w:tcW w:w="1213" w:type="dxa"/>
             <w:vAlign w:val="center"/>
           </w:tcPr>
           <w:p>
@@ -1146,8 +1172,7 @@
         </w:tc>
         <w:tc>
           <w:tcPr>
-            <w:tcW w:w="8032" w:type="dxa"/>
-            <w:vAlign w:val="center"/>
+            <w:tcW w:w="7804" w:type="dxa"/>
           </w:tcPr>
           <w:p>
             <w:pPr>
@@ -1156,6 +1181,9 @@
                 <w:rFonts w:ascii="Consolas" w:hAnsi="Consolas"/>
               </w:rPr>
             </w:pPr>
+            <w:r>
+              <w:t>invoice-view.html</w:t>
+            </w:r>
           </w:p>
         </w:tc>
       </w:tr>
@@ -1166,7 +1194,7 @@
         <w:tc>
           <w:tcPr>
             <w:cnfStyle w:val="001000000000" w:firstRow="0" w:lastRow="0" w:firstColumn="1" w:lastColumn="0" w:oddVBand="0" w:evenVBand="0" w:oddHBand="0" w:evenHBand="0" w:firstRowFirstColumn="0" w:firstRowLastColumn="0" w:lastRowFirstColumn="0" w:lastRowLastColumn="0"/>
-            <w:tcW w:w="985" w:type="dxa"/>
+            <w:tcW w:w="1213" w:type="dxa"/>
             <w:vAlign w:val="center"/>
           </w:tcPr>
           <w:p>
@@ -1192,8 +1220,7 @@
         </w:tc>
         <w:tc>
           <w:tcPr>
-            <w:tcW w:w="8032" w:type="dxa"/>
-            <w:vAlign w:val="center"/>
+            <w:tcW w:w="7804" w:type="dxa"/>
           </w:tcPr>
           <w:p>
             <w:pPr>
@@ -1202,6 +1229,9 @@
                 <w:rFonts w:ascii="Consolas" w:hAnsi="Consolas"/>
               </w:rPr>
             </w:pPr>
+            <w:r>
+              <w:t>order-filter.html</w:t>
+            </w:r>
           </w:p>
         </w:tc>
       </w:tr>
@@ -1266,7 +1296,7 @@
         <w:tc>
           <w:tcPr>
             <w:cnfStyle w:val="001000000000" w:firstRow="0" w:lastRow="0" w:firstColumn="1" w:lastColumn="0" w:oddVBand="0" w:evenVBand="0" w:oddHBand="0" w:evenHBand="0" w:firstRowFirstColumn="0" w:firstRowLastColumn="0" w:lastRowFirstColumn="0" w:lastRowLastColumn="0"/>
-            <w:tcW w:w="985" w:type="dxa"/>
+            <w:tcW w:w="1213" w:type="dxa"/>
             <w:vAlign w:val="center"/>
           </w:tcPr>
           <w:p>
@@ -1287,7 +1317,7 @@
         </w:tc>
         <w:tc>
           <w:tcPr>
-            <w:tcW w:w="8032" w:type="dxa"/>
+            <w:tcW w:w="7804" w:type="dxa"/>
             <w:vAlign w:val="center"/>
           </w:tcPr>
           <w:p>
@@ -1315,7 +1345,7 @@
         <w:tc>
           <w:tcPr>
             <w:cnfStyle w:val="001000000000" w:firstRow="0" w:lastRow="0" w:firstColumn="1" w:lastColumn="0" w:oddVBand="0" w:evenVBand="0" w:oddHBand="0" w:evenHBand="0" w:firstRowFirstColumn="0" w:firstRowLastColumn="0" w:lastRowFirstColumn="0" w:lastRowLastColumn="0"/>
-            <w:tcW w:w="985" w:type="dxa"/>
+            <w:tcW w:w="1213" w:type="dxa"/>
             <w:vAlign w:val="center"/>
           </w:tcPr>
           <w:p>
@@ -1341,8 +1371,7 @@
         </w:tc>
         <w:tc>
           <w:tcPr>
-            <w:tcW w:w="8032" w:type="dxa"/>
-            <w:vAlign w:val="center"/>
+            <w:tcW w:w="7804" w:type="dxa"/>
           </w:tcPr>
           <w:p>
             <w:pPr>
@@ -1351,14 +1380,17 @@
                 <w:rFonts w:ascii="Consolas" w:hAnsi="Consolas"/>
               </w:rPr>
             </w:pPr>
-          </w:p>
-        </w:tc>
-      </w:tr>
-      <w:tr>
-        <w:tc>
-          <w:tcPr>
-            <w:cnfStyle w:val="001000000000" w:firstRow="0" w:lastRow="0" w:firstColumn="1" w:lastColumn="0" w:oddVBand="0" w:evenVBand="0" w:oddHBand="0" w:evenHBand="0" w:firstRowFirstColumn="0" w:firstRowLastColumn="0" w:lastRowFirstColumn="0" w:lastRowLastColumn="0"/>
-            <w:tcW w:w="985" w:type="dxa"/>
+            <w:r>
+              <w:t>profile-view.html</w:t>
+            </w:r>
+          </w:p>
+        </w:tc>
+      </w:tr>
+      <w:tr>
+        <w:tc>
+          <w:tcPr>
+            <w:cnfStyle w:val="001000000000" w:firstRow="0" w:lastRow="0" w:firstColumn="1" w:lastColumn="0" w:oddVBand="0" w:evenVBand="0" w:oddHBand="0" w:evenHBand="0" w:firstRowFirstColumn="0" w:firstRowLastColumn="0" w:lastRowFirstColumn="0" w:lastRowLastColumn="0"/>
+            <w:tcW w:w="1213" w:type="dxa"/>
             <w:vAlign w:val="center"/>
           </w:tcPr>
           <w:p>
@@ -1384,8 +1416,7 @@
         </w:tc>
         <w:tc>
           <w:tcPr>
-            <w:tcW w:w="8032" w:type="dxa"/>
-            <w:vAlign w:val="center"/>
+            <w:tcW w:w="7804" w:type="dxa"/>
           </w:tcPr>
           <w:p>
             <w:pPr>
@@ -1394,6 +1425,9 @@
                 <w:rFonts w:ascii="Consolas" w:hAnsi="Consolas"/>
               </w:rPr>
             </w:pPr>
+            <w:r>
+              <w:t>profile-edit.html</w:t>
+            </w:r>
           </w:p>
         </w:tc>
       </w:tr>
@@ -1404,7 +1438,7 @@
         <w:tc>
           <w:tcPr>
             <w:cnfStyle w:val="001000000000" w:firstRow="0" w:lastRow="0" w:firstColumn="1" w:lastColumn="0" w:oddVBand="0" w:evenVBand="0" w:oddHBand="0" w:evenHBand="0" w:firstRowFirstColumn="0" w:firstRowLastColumn="0" w:lastRowFirstColumn="0" w:lastRowLastColumn="0"/>
-            <w:tcW w:w="985" w:type="dxa"/>
+            <w:tcW w:w="1213" w:type="dxa"/>
             <w:vAlign w:val="center"/>
           </w:tcPr>
           <w:p>
@@ -1430,8 +1464,7 @@
         </w:tc>
         <w:tc>
           <w:tcPr>
-            <w:tcW w:w="8032" w:type="dxa"/>
-            <w:vAlign w:val="center"/>
+            <w:tcW w:w="7804" w:type="dxa"/>
           </w:tcPr>
           <w:p>
             <w:pPr>
@@ -1440,14 +1473,17 @@
                 <w:rFonts w:ascii="Consolas" w:hAnsi="Consolas"/>
               </w:rPr>
             </w:pPr>
-          </w:p>
-        </w:tc>
-      </w:tr>
-      <w:tr>
-        <w:tc>
-          <w:tcPr>
-            <w:cnfStyle w:val="001000000000" w:firstRow="0" w:lastRow="0" w:firstColumn="1" w:lastColumn="0" w:oddVBand="0" w:evenVBand="0" w:oddHBand="0" w:evenHBand="0" w:firstRowFirstColumn="0" w:firstRowLastColumn="0" w:lastRowFirstColumn="0" w:lastRowLastColumn="0"/>
-            <w:tcW w:w="985" w:type="dxa"/>
+            <w:r>
+              <w:t>change-password.html</w:t>
+            </w:r>
+          </w:p>
+        </w:tc>
+      </w:tr>
+      <w:tr>
+        <w:tc>
+          <w:tcPr>
+            <w:cnfStyle w:val="001000000000" w:firstRow="0" w:lastRow="0" w:firstColumn="1" w:lastColumn="0" w:oddVBand="0" w:evenVBand="0" w:oddHBand="0" w:evenHBand="0" w:firstRowFirstColumn="0" w:firstRowLastColumn="0" w:lastRowFirstColumn="0" w:lastRowLastColumn="0"/>
+            <w:tcW w:w="1213" w:type="dxa"/>
             <w:vAlign w:val="center"/>
           </w:tcPr>
           <w:p>
@@ -1473,8 +1509,7 @@
         </w:tc>
         <w:tc>
           <w:tcPr>
-            <w:tcW w:w="8032" w:type="dxa"/>
-            <w:vAlign w:val="center"/>
+            <w:tcW w:w="7804" w:type="dxa"/>
           </w:tcPr>
           <w:p>
             <w:pPr>
@@ -1483,6 +1518,9 @@
                 <w:rFonts w:ascii="Consolas" w:hAnsi="Consolas"/>
               </w:rPr>
             </w:pPr>
+            <w:r>
+              <w:t>address-book.html</w:t>
+            </w:r>
           </w:p>
         </w:tc>
       </w:tr>
@@ -1493,7 +1531,7 @@
         <w:tc>
           <w:tcPr>
             <w:cnfStyle w:val="001000000000" w:firstRow="0" w:lastRow="0" w:firstColumn="1" w:lastColumn="0" w:oddVBand="0" w:evenVBand="0" w:oddHBand="0" w:evenHBand="0" w:firstRowFirstColumn="0" w:firstRowLastColumn="0" w:lastRowFirstColumn="0" w:lastRowLastColumn="0"/>
-            <w:tcW w:w="985" w:type="dxa"/>
+            <w:tcW w:w="1213" w:type="dxa"/>
             <w:vAlign w:val="center"/>
           </w:tcPr>
           <w:p>
@@ -1519,8 +1557,7 @@
         </w:tc>
         <w:tc>
           <w:tcPr>
-            <w:tcW w:w="8032" w:type="dxa"/>
-            <w:vAlign w:val="center"/>
+            <w:tcW w:w="7804" w:type="dxa"/>
           </w:tcPr>
           <w:p>
             <w:pPr>
@@ -1529,14 +1566,17 @@
                 <w:rFonts w:ascii="Consolas" w:hAnsi="Consolas"/>
               </w:rPr>
             </w:pPr>
-          </w:p>
-        </w:tc>
-      </w:tr>
-      <w:tr>
-        <w:tc>
-          <w:tcPr>
-            <w:cnfStyle w:val="001000000000" w:firstRow="0" w:lastRow="0" w:firstColumn="1" w:lastColumn="0" w:oddVBand="0" w:evenVBand="0" w:oddHBand="0" w:evenHBand="0" w:firstRowFirstColumn="0" w:firstRowLastColumn="0" w:lastRowFirstColumn="0" w:lastRowLastColumn="0"/>
-            <w:tcW w:w="985" w:type="dxa"/>
+            <w:r>
+              <w:t>payment-methods.html</w:t>
+            </w:r>
+          </w:p>
+        </w:tc>
+      </w:tr>
+      <w:tr>
+        <w:tc>
+          <w:tcPr>
+            <w:cnfStyle w:val="001000000000" w:firstRow="0" w:lastRow="0" w:firstColumn="1" w:lastColumn="0" w:oddVBand="0" w:evenVBand="0" w:oddHBand="0" w:evenHBand="0" w:firstRowFirstColumn="0" w:firstRowLastColumn="0" w:lastRowFirstColumn="0" w:lastRowLastColumn="0"/>
+            <w:tcW w:w="1213" w:type="dxa"/>
             <w:vAlign w:val="center"/>
           </w:tcPr>
           <w:p>
@@ -1562,8 +1602,7 @@
         </w:tc>
         <w:tc>
           <w:tcPr>
-            <w:tcW w:w="8032" w:type="dxa"/>
-            <w:vAlign w:val="center"/>
+            <w:tcW w:w="7804" w:type="dxa"/>
           </w:tcPr>
           <w:p>
             <w:pPr>
@@ -1572,6 +1611,9 @@
                 <w:rFonts w:ascii="Consolas" w:hAnsi="Consolas"/>
               </w:rPr>
             </w:pPr>
+            <w:r>
+              <w:t>notification-settings.html</w:t>
+            </w:r>
           </w:p>
         </w:tc>
       </w:tr>
@@ -1582,7 +1624,7 @@
         <w:tc>
           <w:tcPr>
             <w:cnfStyle w:val="001000000000" w:firstRow="0" w:lastRow="0" w:firstColumn="1" w:lastColumn="0" w:oddVBand="0" w:evenVBand="0" w:oddHBand="0" w:evenHBand="0" w:firstRowFirstColumn="0" w:firstRowLastColumn="0" w:lastRowFirstColumn="0" w:lastRowLastColumn="0"/>
-            <w:tcW w:w="985" w:type="dxa"/>
+            <w:tcW w:w="1213" w:type="dxa"/>
             <w:vAlign w:val="center"/>
           </w:tcPr>
           <w:p>
@@ -1608,8 +1650,7 @@
         </w:tc>
         <w:tc>
           <w:tcPr>
-            <w:tcW w:w="8032" w:type="dxa"/>
-            <w:vAlign w:val="center"/>
+            <w:tcW w:w="7804" w:type="dxa"/>
           </w:tcPr>
           <w:p>
             <w:pPr>
@@ -1618,6 +1659,9 @@
                 <w:rFonts w:ascii="Consolas" w:hAnsi="Consolas"/>
               </w:rPr>
             </w:pPr>
+            <w:r>
+              <w:t>account-delete.html</w:t>
+            </w:r>
           </w:p>
         </w:tc>
       </w:tr>
@@ -1761,7 +1805,6 @@
         <w:tc>
           <w:tcPr>
             <w:tcW w:w="7804" w:type="dxa"/>
-            <w:vAlign w:val="center"/>
           </w:tcPr>
           <w:p>
             <w:pPr>
@@ -1770,6 +1813,9 @@
                 <w:rFonts w:ascii="Consolas" w:hAnsi="Consolas"/>
               </w:rPr>
             </w:pPr>
+            <w:r>
+              <w:t>order-cancel.html</w:t>
+            </w:r>
           </w:p>
         </w:tc>
       </w:tr>
@@ -1804,7 +1850,6 @@
         <w:tc>
           <w:tcPr>
             <w:tcW w:w="7804" w:type="dxa"/>
-            <w:vAlign w:val="center"/>
           </w:tcPr>
           <w:p>
             <w:pPr>
@@ -1813,6 +1858,9 @@
                 <w:rFonts w:ascii="Consolas" w:hAnsi="Consolas"/>
               </w:rPr>
             </w:pPr>
+            <w:r>
+              <w:t>cancel-confirmation.html</w:t>
+            </w:r>
           </w:p>
         </w:tc>
       </w:tr>
@@ -1850,7 +1898,6 @@
         <w:tc>
           <w:tcPr>
             <w:tcW w:w="7804" w:type="dxa"/>
-            <w:vAlign w:val="center"/>
           </w:tcPr>
           <w:p>
             <w:pPr>
@@ -1859,6 +1906,9 @@
                 <w:rFonts w:ascii="Consolas" w:hAnsi="Consolas"/>
               </w:rPr>
             </w:pPr>
+            <w:r>
+              <w:t>cancellation-policy.html</w:t>
+            </w:r>
           </w:p>
         </w:tc>
       </w:tr>
@@ -1893,7 +1943,6 @@
         <w:tc>
           <w:tcPr>
             <w:tcW w:w="7804" w:type="dxa"/>
-            <w:vAlign w:val="center"/>
           </w:tcPr>
           <w:p>
             <w:pPr>
@@ -1902,6 +1951,9 @@
                 <w:rFonts w:ascii="Consolas" w:hAnsi="Consolas"/>
               </w:rPr>
             </w:pPr>
+            <w:r>
+              <w:t>refund-status.html</w:t>
+            </w:r>
           </w:p>
         </w:tc>
       </w:tr>
@@ -1939,7 +1991,6 @@
         <w:tc>
           <w:tcPr>
             <w:tcW w:w="7804" w:type="dxa"/>
-            <w:vAlign w:val="center"/>
           </w:tcPr>
           <w:p>
             <w:pPr>
@@ -1948,6 +1999,9 @@
                 <w:rFonts w:ascii="Consolas" w:hAnsi="Consolas"/>
               </w:rPr>
             </w:pPr>
+            <w:r>
+              <w:t>cancel-history.html</w:t>
+            </w:r>
           </w:p>
         </w:tc>
       </w:tr>
@@ -1982,7 +2036,6 @@
         <w:tc>
           <w:tcPr>
             <w:tcW w:w="7804" w:type="dxa"/>
-            <w:vAlign w:val="center"/>
           </w:tcPr>
           <w:p>
             <w:pPr>
@@ -1991,6 +2044,9 @@
                 <w:rFonts w:ascii="Consolas" w:hAnsi="Consolas"/>
               </w:rPr>
             </w:pPr>
+            <w:r>
+              <w:t>cancel-support.html</w:t>
+            </w:r>
           </w:p>
         </w:tc>
       </w:tr>
@@ -2028,7 +2084,6 @@
         <w:tc>
           <w:tcPr>
             <w:tcW w:w="7804" w:type="dxa"/>
-            <w:vAlign w:val="center"/>
           </w:tcPr>
           <w:p>
             <w:pPr>
@@ -2037,6 +2092,9 @@
                 <w:rFonts w:ascii="Consolas" w:hAnsi="Consolas"/>
               </w:rPr>
             </w:pPr>
+            <w:r>
+              <w:t>cancel-feedback.html</w:t>
+            </w:r>
           </w:p>
         </w:tc>
       </w:tr>
@@ -2140,7 +2198,7 @@
         <w:tc>
           <w:tcPr>
             <w:cnfStyle w:val="001000000000" w:firstRow="0" w:lastRow="0" w:firstColumn="1" w:lastColumn="0" w:oddVBand="0" w:evenVBand="0" w:oddHBand="0" w:evenHBand="0" w:firstRowFirstColumn="0" w:firstRowLastColumn="0" w:lastRowFirstColumn="0" w:lastRowLastColumn="0"/>
-            <w:tcW w:w="985" w:type="dxa"/>
+            <w:tcW w:w="1213" w:type="dxa"/>
             <w:vAlign w:val="center"/>
           </w:tcPr>
           <w:p>
@@ -2161,7 +2219,7 @@
         </w:tc>
         <w:tc>
           <w:tcPr>
-            <w:tcW w:w="8032" w:type="dxa"/>
+            <w:tcW w:w="7804" w:type="dxa"/>
             <w:vAlign w:val="center"/>
           </w:tcPr>
           <w:p>
@@ -2189,7 +2247,7 @@
         <w:tc>
           <w:tcPr>
             <w:cnfStyle w:val="001000000000" w:firstRow="0" w:lastRow="0" w:firstColumn="1" w:lastColumn="0" w:oddVBand="0" w:evenVBand="0" w:oddHBand="0" w:evenHBand="0" w:firstRowFirstColumn="0" w:firstRowLastColumn="0" w:lastRowFirstColumn="0" w:lastRowLastColumn="0"/>
-            <w:tcW w:w="985" w:type="dxa"/>
+            <w:tcW w:w="1213" w:type="dxa"/>
             <w:vAlign w:val="center"/>
           </w:tcPr>
           <w:p>
@@ -2215,8 +2273,7 @@
         </w:tc>
         <w:tc>
           <w:tcPr>
-            <w:tcW w:w="8032" w:type="dxa"/>
-            <w:vAlign w:val="center"/>
+            <w:tcW w:w="7804" w:type="dxa"/>
           </w:tcPr>
           <w:p>
             <w:pPr>
@@ -2225,14 +2282,17 @@
                 <w:rFonts w:ascii="Consolas" w:hAnsi="Consolas"/>
               </w:rPr>
             </w:pPr>
-          </w:p>
-        </w:tc>
-      </w:tr>
-      <w:tr>
-        <w:tc>
-          <w:tcPr>
-            <w:cnfStyle w:val="001000000000" w:firstRow="0" w:lastRow="0" w:firstColumn="1" w:lastColumn="0" w:oddVBand="0" w:evenVBand="0" w:oddHBand="0" w:evenHBand="0" w:firstRowFirstColumn="0" w:firstRowLastColumn="0" w:lastRowFirstColumn="0" w:lastRowLastColumn="0"/>
-            <w:tcW w:w="985" w:type="dxa"/>
+            <w:r>
+              <w:t>staff-login.html</w:t>
+            </w:r>
+          </w:p>
+        </w:tc>
+      </w:tr>
+      <w:tr>
+        <w:tc>
+          <w:tcPr>
+            <w:cnfStyle w:val="001000000000" w:firstRow="0" w:lastRow="0" w:firstColumn="1" w:lastColumn="0" w:oddVBand="0" w:evenVBand="0" w:oddHBand="0" w:evenHBand="0" w:firstRowFirstColumn="0" w:firstRowLastColumn="0" w:lastRowFirstColumn="0" w:lastRowLastColumn="0"/>
+            <w:tcW w:w="1213" w:type="dxa"/>
             <w:vAlign w:val="center"/>
           </w:tcPr>
           <w:p>
@@ -2258,8 +2318,7 @@
         </w:tc>
         <w:tc>
           <w:tcPr>
-            <w:tcW w:w="8032" w:type="dxa"/>
-            <w:vAlign w:val="center"/>
+            <w:tcW w:w="7804" w:type="dxa"/>
           </w:tcPr>
           <w:p>
             <w:pPr>
@@ -2268,6 +2327,9 @@
                 <w:rFonts w:ascii="Consolas" w:hAnsi="Consolas"/>
               </w:rPr>
             </w:pPr>
+            <w:r>
+              <w:t>staff-dashboard.html</w:t>
+            </w:r>
           </w:p>
         </w:tc>
       </w:tr>
@@ -2278,7 +2340,7 @@
         <w:tc>
           <w:tcPr>
             <w:cnfStyle w:val="001000000000" w:firstRow="0" w:lastRow="0" w:firstColumn="1" w:lastColumn="0" w:oddVBand="0" w:evenVBand="0" w:oddHBand="0" w:evenHBand="0" w:firstRowFirstColumn="0" w:firstRowLastColumn="0" w:lastRowFirstColumn="0" w:lastRowLastColumn="0"/>
-            <w:tcW w:w="985" w:type="dxa"/>
+            <w:tcW w:w="1213" w:type="dxa"/>
             <w:vAlign w:val="center"/>
           </w:tcPr>
           <w:p>
@@ -2304,8 +2366,7 @@
         </w:tc>
         <w:tc>
           <w:tcPr>
-            <w:tcW w:w="8032" w:type="dxa"/>
-            <w:vAlign w:val="center"/>
+            <w:tcW w:w="7804" w:type="dxa"/>
           </w:tcPr>
           <w:p>
             <w:pPr>
@@ -2314,14 +2375,17 @@
                 <w:rFonts w:ascii="Consolas" w:hAnsi="Consolas"/>
               </w:rPr>
             </w:pPr>
-          </w:p>
-        </w:tc>
-      </w:tr>
-      <w:tr>
-        <w:tc>
-          <w:tcPr>
-            <w:cnfStyle w:val="001000000000" w:firstRow="0" w:lastRow="0" w:firstColumn="1" w:lastColumn="0" w:oddVBand="0" w:evenVBand="0" w:oddHBand="0" w:evenHBand="0" w:firstRowFirstColumn="0" w:firstRowLastColumn="0" w:lastRowFirstColumn="0" w:lastRowLastColumn="0"/>
-            <w:tcW w:w="985" w:type="dxa"/>
+            <w:r>
+              <w:t>product-catalog.html</w:t>
+            </w:r>
+          </w:p>
+        </w:tc>
+      </w:tr>
+      <w:tr>
+        <w:tc>
+          <w:tcPr>
+            <w:cnfStyle w:val="001000000000" w:firstRow="0" w:lastRow="0" w:firstColumn="1" w:lastColumn="0" w:oddVBand="0" w:evenVBand="0" w:oddHBand="0" w:evenHBand="0" w:firstRowFirstColumn="0" w:firstRowLastColumn="0" w:lastRowFirstColumn="0" w:lastRowLastColumn="0"/>
+            <w:tcW w:w="1213" w:type="dxa"/>
             <w:vAlign w:val="center"/>
           </w:tcPr>
           <w:p>
@@ -2347,8 +2411,7 @@
         </w:tc>
         <w:tc>
           <w:tcPr>
-            <w:tcW w:w="8032" w:type="dxa"/>
-            <w:vAlign w:val="center"/>
+            <w:tcW w:w="7804" w:type="dxa"/>
           </w:tcPr>
           <w:p>
             <w:pPr>
@@ -2357,6 +2420,9 @@
                 <w:rFonts w:ascii="Consolas" w:hAnsi="Consolas"/>
               </w:rPr>
             </w:pPr>
+            <w:r>
+              <w:t>product-add.html</w:t>
+            </w:r>
           </w:p>
         </w:tc>
       </w:tr>
@@ -2367,7 +2433,7 @@
         <w:tc>
           <w:tcPr>
             <w:cnfStyle w:val="001000000000" w:firstRow="0" w:lastRow="0" w:firstColumn="1" w:lastColumn="0" w:oddVBand="0" w:evenVBand="0" w:oddHBand="0" w:evenHBand="0" w:firstRowFirstColumn="0" w:firstRowLastColumn="0" w:lastRowFirstColumn="0" w:lastRowLastColumn="0"/>
-            <w:tcW w:w="985" w:type="dxa"/>
+            <w:tcW w:w="1213" w:type="dxa"/>
             <w:vAlign w:val="center"/>
           </w:tcPr>
           <w:p>
@@ -2393,8 +2459,7 @@
         </w:tc>
         <w:tc>
           <w:tcPr>
-            <w:tcW w:w="8032" w:type="dxa"/>
-            <w:vAlign w:val="center"/>
+            <w:tcW w:w="7804" w:type="dxa"/>
           </w:tcPr>
           <w:p>
             <w:pPr>
@@ -2403,14 +2468,17 @@
                 <w:rFonts w:ascii="Consolas" w:hAnsi="Consolas"/>
               </w:rPr>
             </w:pPr>
-          </w:p>
-        </w:tc>
-      </w:tr>
-      <w:tr>
-        <w:tc>
-          <w:tcPr>
-            <w:cnfStyle w:val="001000000000" w:firstRow="0" w:lastRow="0" w:firstColumn="1" w:lastColumn="0" w:oddVBand="0" w:evenVBand="0" w:oddHBand="0" w:evenHBand="0" w:firstRowFirstColumn="0" w:firstRowLastColumn="0" w:lastRowFirstColumn="0" w:lastRowLastColumn="0"/>
-            <w:tcW w:w="985" w:type="dxa"/>
+            <w:r>
+              <w:t>product-category.html</w:t>
+            </w:r>
+          </w:p>
+        </w:tc>
+      </w:tr>
+      <w:tr>
+        <w:tc>
+          <w:tcPr>
+            <w:cnfStyle w:val="001000000000" w:firstRow="0" w:lastRow="0" w:firstColumn="1" w:lastColumn="0" w:oddVBand="0" w:evenVBand="0" w:oddHBand="0" w:evenHBand="0" w:firstRowFirstColumn="0" w:firstRowLastColumn="0" w:lastRowFirstColumn="0" w:lastRowLastColumn="0"/>
+            <w:tcW w:w="1213" w:type="dxa"/>
             <w:vAlign w:val="center"/>
           </w:tcPr>
           <w:p>
@@ -2436,8 +2504,7 @@
         </w:tc>
         <w:tc>
           <w:tcPr>
-            <w:tcW w:w="8032" w:type="dxa"/>
-            <w:vAlign w:val="center"/>
+            <w:tcW w:w="7804" w:type="dxa"/>
           </w:tcPr>
           <w:p>
             <w:pPr>
@@ -2446,6 +2513,9 @@
                 <w:rFonts w:ascii="Consolas" w:hAnsi="Consolas"/>
               </w:rPr>
             </w:pPr>
+            <w:r>
+              <w:t>product-pricing.html</w:t>
+            </w:r>
           </w:p>
         </w:tc>
       </w:tr>
@@ -2456,7 +2526,7 @@
         <w:tc>
           <w:tcPr>
             <w:cnfStyle w:val="001000000000" w:firstRow="0" w:lastRow="0" w:firstColumn="1" w:lastColumn="0" w:oddVBand="0" w:evenVBand="0" w:oddHBand="0" w:evenHBand="0" w:firstRowFirstColumn="0" w:firstRowLastColumn="0" w:lastRowFirstColumn="0" w:lastRowLastColumn="0"/>
-            <w:tcW w:w="985" w:type="dxa"/>
+            <w:tcW w:w="1213" w:type="dxa"/>
             <w:vAlign w:val="center"/>
           </w:tcPr>
           <w:p>
@@ -2482,8 +2552,7 @@
         </w:tc>
         <w:tc>
           <w:tcPr>
-            <w:tcW w:w="8032" w:type="dxa"/>
-            <w:vAlign w:val="center"/>
+            <w:tcW w:w="7804" w:type="dxa"/>
           </w:tcPr>
           <w:p>
             <w:pPr>
@@ -2492,6 +2561,9 @@
                 <w:rFonts w:ascii="Consolas" w:hAnsi="Consolas"/>
               </w:rPr>
             </w:pPr>
+            <w:r>
+              <w:t>product-images.html</w:t>
+            </w:r>
           </w:p>
         </w:tc>
       </w:tr>
@@ -2639,7 +2711,6 @@
         <w:tc>
           <w:tcPr>
             <w:tcW w:w="7804" w:type="dxa"/>
-            <w:vAlign w:val="center"/>
           </w:tcPr>
           <w:p>
             <w:pPr>
@@ -2648,6 +2719,9 @@
                 <w:rFonts w:ascii="Consolas" w:hAnsi="Consolas"/>
               </w:rPr>
             </w:pPr>
+            <w:r>
+              <w:t>materials-inventory.html</w:t>
+            </w:r>
           </w:p>
         </w:tc>
       </w:tr>
@@ -2682,7 +2756,6 @@
         <w:tc>
           <w:tcPr>
             <w:tcW w:w="7804" w:type="dxa"/>
-            <w:vAlign w:val="center"/>
           </w:tcPr>
           <w:p>
             <w:pPr>
@@ -2691,6 +2764,9 @@
                 <w:rFonts w:ascii="Consolas" w:hAnsi="Consolas"/>
               </w:rPr>
             </w:pPr>
+            <w:r>
+              <w:t>material-add.html</w:t>
+            </w:r>
           </w:p>
         </w:tc>
       </w:tr>
@@ -2728,7 +2804,6 @@
         <w:tc>
           <w:tcPr>
             <w:tcW w:w="7804" w:type="dxa"/>
-            <w:vAlign w:val="center"/>
           </w:tcPr>
           <w:p>
             <w:pPr>
@@ -2737,6 +2812,9 @@
                 <w:rFonts w:ascii="Consolas" w:hAnsi="Consolas"/>
               </w:rPr>
             </w:pPr>
+            <w:r>
+              <w:t>material-categories.html</w:t>
+            </w:r>
           </w:p>
         </w:tc>
       </w:tr>
@@ -2771,7 +2849,6 @@
         <w:tc>
           <w:tcPr>
             <w:tcW w:w="7804" w:type="dxa"/>
-            <w:vAlign w:val="center"/>
           </w:tcPr>
           <w:p>
             <w:pPr>
@@ -2780,6 +2857,9 @@
                 <w:rFonts w:ascii="Consolas" w:hAnsi="Consolas"/>
               </w:rPr>
             </w:pPr>
+            <w:r>
+              <w:t>material-suppliers.html</w:t>
+            </w:r>
           </w:p>
         </w:tc>
       </w:tr>
@@ -2817,7 +2897,6 @@
         <w:tc>
           <w:tcPr>
             <w:tcW w:w="7804" w:type="dxa"/>
-            <w:vAlign w:val="center"/>
           </w:tcPr>
           <w:p>
             <w:pPr>
@@ -2826,6 +2905,9 @@
                 <w:rFonts w:ascii="Consolas" w:hAnsi="Consolas"/>
               </w:rPr>
             </w:pPr>
+            <w:r>
+              <w:t>material-stock.html</w:t>
+            </w:r>
           </w:p>
         </w:tc>
       </w:tr>
@@ -2860,7 +2942,6 @@
         <w:tc>
           <w:tcPr>
             <w:tcW w:w="7804" w:type="dxa"/>
-            <w:vAlign w:val="center"/>
           </w:tcPr>
           <w:p>
             <w:pPr>
@@ -2869,6 +2950,9 @@
                 <w:rFonts w:ascii="Consolas" w:hAnsi="Consolas"/>
               </w:rPr>
             </w:pPr>
+            <w:r>
+              <w:t>material-reorder.html</w:t>
+            </w:r>
           </w:p>
         </w:tc>
       </w:tr>
@@ -2906,7 +2990,6 @@
         <w:tc>
           <w:tcPr>
             <w:tcW w:w="7804" w:type="dxa"/>
-            <w:vAlign w:val="center"/>
           </w:tcPr>
           <w:p>
             <w:pPr>
@@ -2915,6 +2998,9 @@
                 <w:rFonts w:ascii="Consolas" w:hAnsi="Consolas"/>
               </w:rPr>
             </w:pPr>
+            <w:r>
+              <w:t>material-cost.html</w:t>
+            </w:r>
           </w:p>
         </w:tc>
       </w:tr>
@@ -2973,7 +3059,7 @@
         <w:tc>
           <w:tcPr>
             <w:cnfStyle w:val="001000000000" w:firstRow="0" w:lastRow="0" w:firstColumn="1" w:lastColumn="0" w:oddVBand="0" w:evenVBand="0" w:oddHBand="0" w:evenHBand="0" w:firstRowFirstColumn="0" w:firstRowLastColumn="0" w:lastRowFirstColumn="0" w:lastRowLastColumn="0"/>
-            <w:tcW w:w="985" w:type="dxa"/>
+            <w:tcW w:w="1213" w:type="dxa"/>
             <w:vAlign w:val="center"/>
           </w:tcPr>
           <w:p>
@@ -2994,7 +3080,7 @@
         </w:tc>
         <w:tc>
           <w:tcPr>
-            <w:tcW w:w="8032" w:type="dxa"/>
+            <w:tcW w:w="7804" w:type="dxa"/>
             <w:vAlign w:val="center"/>
           </w:tcPr>
           <w:p>
@@ -3022,7 +3108,7 @@
         <w:tc>
           <w:tcPr>
             <w:cnfStyle w:val="001000000000" w:firstRow="0" w:lastRow="0" w:firstColumn="1" w:lastColumn="0" w:oddVBand="0" w:evenVBand="0" w:oddHBand="0" w:evenHBand="0" w:firstRowFirstColumn="0" w:firstRowLastColumn="0" w:lastRowFirstColumn="0" w:lastRowLastColumn="0"/>
-            <w:tcW w:w="985" w:type="dxa"/>
+            <w:tcW w:w="1213" w:type="dxa"/>
             <w:vAlign w:val="center"/>
           </w:tcPr>
           <w:p>
@@ -3048,8 +3134,7 @@
         </w:tc>
         <w:tc>
           <w:tcPr>
-            <w:tcW w:w="8032" w:type="dxa"/>
-            <w:vAlign w:val="center"/>
+            <w:tcW w:w="7804" w:type="dxa"/>
           </w:tcPr>
           <w:p>
             <w:pPr>
@@ -3058,14 +3143,17 @@
                 <w:rFonts w:ascii="Consolas" w:hAnsi="Consolas"/>
               </w:rPr>
             </w:pPr>
-          </w:p>
-        </w:tc>
-      </w:tr>
-      <w:tr>
-        <w:tc>
-          <w:tcPr>
-            <w:cnfStyle w:val="001000000000" w:firstRow="0" w:lastRow="0" w:firstColumn="1" w:lastColumn="0" w:oddVBand="0" w:evenVBand="0" w:oddHBand="0" w:evenHBand="0" w:firstRowFirstColumn="0" w:firstRowLastColumn="0" w:lastRowFirstColumn="0" w:lastRowLastColumn="0"/>
-            <w:tcW w:w="985" w:type="dxa"/>
+            <w:r>
+              <w:t>order-management.html</w:t>
+            </w:r>
+          </w:p>
+        </w:tc>
+      </w:tr>
+      <w:tr>
+        <w:tc>
+          <w:tcPr>
+            <w:cnfStyle w:val="001000000000" w:firstRow="0" w:lastRow="0" w:firstColumn="1" w:lastColumn="0" w:oddVBand="0" w:evenVBand="0" w:oddHBand="0" w:evenHBand="0" w:firstRowFirstColumn="0" w:firstRowLastColumn="0" w:lastRowFirstColumn="0" w:lastRowLastColumn="0"/>
+            <w:tcW w:w="1213" w:type="dxa"/>
             <w:vAlign w:val="center"/>
           </w:tcPr>
           <w:p>
@@ -3091,8 +3179,7 @@
         </w:tc>
         <w:tc>
           <w:tcPr>
-            <w:tcW w:w="8032" w:type="dxa"/>
-            <w:vAlign w:val="center"/>
+            <w:tcW w:w="7804" w:type="dxa"/>
           </w:tcPr>
           <w:p>
             <w:pPr>
@@ -3101,6 +3188,9 @@
                 <w:rFonts w:ascii="Consolas" w:hAnsi="Consolas"/>
               </w:rPr>
             </w:pPr>
+            <w:r>
+              <w:t>order-edit.html</w:t>
+            </w:r>
           </w:p>
         </w:tc>
       </w:tr>
@@ -3111,7 +3201,7 @@
         <w:tc>
           <w:tcPr>
             <w:cnfStyle w:val="001000000000" w:firstRow="0" w:lastRow="0" w:firstColumn="1" w:lastColumn="0" w:oddVBand="0" w:evenVBand="0" w:oddHBand="0" w:evenHBand="0" w:firstRowFirstColumn="0" w:firstRowLastColumn="0" w:lastRowFirstColumn="0" w:lastRowLastColumn="0"/>
-            <w:tcW w:w="985" w:type="dxa"/>
+            <w:tcW w:w="1213" w:type="dxa"/>
             <w:vAlign w:val="center"/>
           </w:tcPr>
           <w:p>
@@ -3137,8 +3227,7 @@
         </w:tc>
         <w:tc>
           <w:tcPr>
-            <w:tcW w:w="8032" w:type="dxa"/>
-            <w:vAlign w:val="center"/>
+            <w:tcW w:w="7804" w:type="dxa"/>
           </w:tcPr>
           <w:p>
             <w:pPr>
@@ -3147,14 +3236,17 @@
                 <w:rFonts w:ascii="Consolas" w:hAnsi="Consolas"/>
               </w:rPr>
             </w:pPr>
-          </w:p>
-        </w:tc>
-      </w:tr>
-      <w:tr>
-        <w:tc>
-          <w:tcPr>
-            <w:cnfStyle w:val="001000000000" w:firstRow="0" w:lastRow="0" w:firstColumn="1" w:lastColumn="0" w:oddVBand="0" w:evenVBand="0" w:oddHBand="0" w:evenHBand="0" w:firstRowFirstColumn="0" w:firstRowLastColumn="0" w:lastRowFirstColumn="0" w:lastRowLastColumn="0"/>
-            <w:tcW w:w="985" w:type="dxa"/>
+            <w:r>
+              <w:t>order-status.html</w:t>
+            </w:r>
+          </w:p>
+        </w:tc>
+      </w:tr>
+      <w:tr>
+        <w:tc>
+          <w:tcPr>
+            <w:cnfStyle w:val="001000000000" w:firstRow="0" w:lastRow="0" w:firstColumn="1" w:lastColumn="0" w:oddVBand="0" w:evenVBand="0" w:oddHBand="0" w:evenHBand="0" w:firstRowFirstColumn="0" w:firstRowLastColumn="0" w:lastRowFirstColumn="0" w:lastRowLastColumn="0"/>
+            <w:tcW w:w="1213" w:type="dxa"/>
             <w:vAlign w:val="center"/>
           </w:tcPr>
           <w:p>
@@ -3180,8 +3272,7 @@
         </w:tc>
         <w:tc>
           <w:tcPr>
-            <w:tcW w:w="8032" w:type="dxa"/>
-            <w:vAlign w:val="center"/>
+            <w:tcW w:w="7804" w:type="dxa"/>
           </w:tcPr>
           <w:p>
             <w:pPr>
@@ -3190,6 +3281,9 @@
                 <w:rFonts w:ascii="Consolas" w:hAnsi="Consolas"/>
               </w:rPr>
             </w:pPr>
+            <w:r>
+              <w:t>order-assign.html</w:t>
+            </w:r>
           </w:p>
         </w:tc>
       </w:tr>
@@ -3200,7 +3294,7 @@
         <w:tc>
           <w:tcPr>
             <w:cnfStyle w:val="001000000000" w:firstRow="0" w:lastRow="0" w:firstColumn="1" w:lastColumn="0" w:oddVBand="0" w:evenVBand="0" w:oddHBand="0" w:evenHBand="0" w:firstRowFirstColumn="0" w:firstRowLastColumn="0" w:lastRowFirstColumn="0" w:lastRowLastColumn="0"/>
-            <w:tcW w:w="985" w:type="dxa"/>
+            <w:tcW w:w="1213" w:type="dxa"/>
             <w:vAlign w:val="center"/>
           </w:tcPr>
           <w:p>
@@ -3226,8 +3320,7 @@
         </w:tc>
         <w:tc>
           <w:tcPr>
-            <w:tcW w:w="8032" w:type="dxa"/>
-            <w:vAlign w:val="center"/>
+            <w:tcW w:w="7804" w:type="dxa"/>
           </w:tcPr>
           <w:p>
             <w:pPr>
@@ -3236,14 +3329,17 @@
                 <w:rFonts w:ascii="Consolas" w:hAnsi="Consolas"/>
               </w:rPr>
             </w:pPr>
-          </w:p>
-        </w:tc>
-      </w:tr>
-      <w:tr>
-        <w:tc>
-          <w:tcPr>
-            <w:cnfStyle w:val="001000000000" w:firstRow="0" w:lastRow="0" w:firstColumn="1" w:lastColumn="0" w:oddVBand="0" w:evenVBand="0" w:oddHBand="0" w:evenHBand="0" w:firstRowFirstColumn="0" w:firstRowLastColumn="0" w:lastRowFirstColumn="0" w:lastRowLastColumn="0"/>
-            <w:tcW w:w="985" w:type="dxa"/>
+            <w:r>
+              <w:t>material-allocate.html</w:t>
+            </w:r>
+          </w:p>
+        </w:tc>
+      </w:tr>
+      <w:tr>
+        <w:tc>
+          <w:tcPr>
+            <w:cnfStyle w:val="001000000000" w:firstRow="0" w:lastRow="0" w:firstColumn="1" w:lastColumn="0" w:oddVBand="0" w:evenVBand="0" w:oddHBand="0" w:evenHBand="0" w:firstRowFirstColumn="0" w:firstRowLastColumn="0" w:lastRowFirstColumn="0" w:lastRowLastColumn="0"/>
+            <w:tcW w:w="1213" w:type="dxa"/>
             <w:vAlign w:val="center"/>
           </w:tcPr>
           <w:p>
@@ -3269,8 +3365,7 @@
         </w:tc>
         <w:tc>
           <w:tcPr>
-            <w:tcW w:w="8032" w:type="dxa"/>
-            <w:vAlign w:val="center"/>
+            <w:tcW w:w="7804" w:type="dxa"/>
           </w:tcPr>
           <w:p>
             <w:pPr>
@@ -3279,6 +3374,9 @@
                 <w:rFonts w:ascii="Consolas" w:hAnsi="Consolas"/>
               </w:rPr>
             </w:pPr>
+            <w:r>
+              <w:t>material-usage.html</w:t>
+            </w:r>
           </w:p>
         </w:tc>
       </w:tr>
@@ -3289,7 +3387,7 @@
         <w:tc>
           <w:tcPr>
             <w:cnfStyle w:val="001000000000" w:firstRow="0" w:lastRow="0" w:firstColumn="1" w:lastColumn="0" w:oddVBand="0" w:evenVBand="0" w:oddHBand="0" w:evenHBand="0" w:firstRowFirstColumn="0" w:firstRowLastColumn="0" w:lastRowFirstColumn="0" w:lastRowLastColumn="0"/>
-            <w:tcW w:w="985" w:type="dxa"/>
+            <w:tcW w:w="1213" w:type="dxa"/>
             <w:vAlign w:val="center"/>
           </w:tcPr>
           <w:p>
@@ -3315,8 +3413,7 @@
         </w:tc>
         <w:tc>
           <w:tcPr>
-            <w:tcW w:w="8032" w:type="dxa"/>
-            <w:vAlign w:val="center"/>
+            <w:tcW w:w="7804" w:type="dxa"/>
           </w:tcPr>
           <w:p>
             <w:pPr>
@@ -3325,6 +3422,9 @@
                 <w:rFonts w:ascii="Consolas" w:hAnsi="Consolas"/>
               </w:rPr>
             </w:pPr>
+            <w:r>
+              <w:t>production-schedule.html</w:t>
+            </w:r>
           </w:p>
         </w:tc>
       </w:tr>
@@ -3397,7 +3497,7 @@
         <w:tc>
           <w:tcPr>
             <w:cnfStyle w:val="001000000000" w:firstRow="0" w:lastRow="0" w:firstColumn="1" w:lastColumn="0" w:oddVBand="0" w:evenVBand="0" w:oddHBand="0" w:evenHBand="0" w:firstRowFirstColumn="0" w:firstRowLastColumn="0" w:lastRowFirstColumn="0" w:lastRowLastColumn="0"/>
-            <w:tcW w:w="985" w:type="dxa"/>
+            <w:tcW w:w="1213" w:type="dxa"/>
             <w:vAlign w:val="center"/>
           </w:tcPr>
           <w:p>
@@ -3418,7 +3518,7 @@
         </w:tc>
         <w:tc>
           <w:tcPr>
-            <w:tcW w:w="8032" w:type="dxa"/>
+            <w:tcW w:w="7804" w:type="dxa"/>
             <w:vAlign w:val="center"/>
           </w:tcPr>
           <w:p>
@@ -3446,7 +3546,7 @@
         <w:tc>
           <w:tcPr>
             <w:cnfStyle w:val="001000000000" w:firstRow="0" w:lastRow="0" w:firstColumn="1" w:lastColumn="0" w:oddVBand="0" w:evenVBand="0" w:oddHBand="0" w:evenHBand="0" w:firstRowFirstColumn="0" w:firstRowLastColumn="0" w:lastRowFirstColumn="0" w:lastRowLastColumn="0"/>
-            <w:tcW w:w="985" w:type="dxa"/>
+            <w:tcW w:w="1213" w:type="dxa"/>
             <w:vAlign w:val="center"/>
           </w:tcPr>
           <w:p>
@@ -3472,8 +3572,7 @@
         </w:tc>
         <w:tc>
           <w:tcPr>
-            <w:tcW w:w="8032" w:type="dxa"/>
-            <w:vAlign w:val="center"/>
+            <w:tcW w:w="7804" w:type="dxa"/>
           </w:tcPr>
           <w:p>
             <w:pPr>
@@ -3482,14 +3581,17 @@
                 <w:rFonts w:ascii="Consolas" w:hAnsi="Consolas"/>
               </w:rPr>
             </w:pPr>
-          </w:p>
-        </w:tc>
-      </w:tr>
-      <w:tr>
-        <w:tc>
-          <w:tcPr>
-            <w:cnfStyle w:val="001000000000" w:firstRow="0" w:lastRow="0" w:firstColumn="1" w:lastColumn="0" w:oddVBand="0" w:evenVBand="0" w:oddHBand="0" w:evenHBand="0" w:firstRowFirstColumn="0" w:firstRowLastColumn="0" w:lastRowFirstColumn="0" w:lastRowLastColumn="0"/>
-            <w:tcW w:w="985" w:type="dxa"/>
+            <w:r>
+              <w:t>reports-dashboard.html</w:t>
+            </w:r>
+          </w:p>
+        </w:tc>
+      </w:tr>
+      <w:tr>
+        <w:tc>
+          <w:tcPr>
+            <w:cnfStyle w:val="001000000000" w:firstRow="0" w:lastRow="0" w:firstColumn="1" w:lastColumn="0" w:oddVBand="0" w:evenVBand="0" w:oddHBand="0" w:evenHBand="0" w:firstRowFirstColumn="0" w:firstRowLastColumn="0" w:lastRowFirstColumn="0" w:lastRowLastColumn="0"/>
+            <w:tcW w:w="1213" w:type="dxa"/>
             <w:vAlign w:val="center"/>
           </w:tcPr>
           <w:p>
@@ -3515,8 +3617,7 @@
         </w:tc>
         <w:tc>
           <w:tcPr>
-            <w:tcW w:w="8032" w:type="dxa"/>
-            <w:vAlign w:val="center"/>
+            <w:tcW w:w="7804" w:type="dxa"/>
           </w:tcPr>
           <w:p>
             <w:pPr>
@@ -3525,6 +3626,9 @@
                 <w:rFonts w:ascii="Consolas" w:hAnsi="Consolas"/>
               </w:rPr>
             </w:pPr>
+            <w:r>
+              <w:t>sales-report.html</w:t>
+            </w:r>
           </w:p>
         </w:tc>
       </w:tr>
@@ -3535,7 +3639,7 @@
         <w:tc>
           <w:tcPr>
             <w:cnfStyle w:val="001000000000" w:firstRow="0" w:lastRow="0" w:firstColumn="1" w:lastColumn="0" w:oddVBand="0" w:evenVBand="0" w:oddHBand="0" w:evenHBand="0" w:firstRowFirstColumn="0" w:firstRowLastColumn="0" w:lastRowFirstColumn="0" w:lastRowLastColumn="0"/>
-            <w:tcW w:w="985" w:type="dxa"/>
+            <w:tcW w:w="1213" w:type="dxa"/>
             <w:vAlign w:val="center"/>
           </w:tcPr>
           <w:p>
@@ -3561,8 +3665,7 @@
         </w:tc>
         <w:tc>
           <w:tcPr>
-            <w:tcW w:w="8032" w:type="dxa"/>
-            <w:vAlign w:val="center"/>
+            <w:tcW w:w="7804" w:type="dxa"/>
           </w:tcPr>
           <w:p>
             <w:pPr>
@@ -3571,14 +3674,17 @@
                 <w:rFonts w:ascii="Consolas" w:hAnsi="Consolas"/>
               </w:rPr>
             </w:pPr>
-          </w:p>
-        </w:tc>
-      </w:tr>
-      <w:tr>
-        <w:tc>
-          <w:tcPr>
-            <w:cnfStyle w:val="001000000000" w:firstRow="0" w:lastRow="0" w:firstColumn="1" w:lastColumn="0" w:oddVBand="0" w:evenVBand="0" w:oddHBand="0" w:evenHBand="0" w:firstRowFirstColumn="0" w:firstRowLastColumn="0" w:lastRowFirstColumn="0" w:lastRowLastColumn="0"/>
-            <w:tcW w:w="985" w:type="dxa"/>
+            <w:r>
+              <w:t>inventory-report.html</w:t>
+            </w:r>
+          </w:p>
+        </w:tc>
+      </w:tr>
+      <w:tr>
+        <w:tc>
+          <w:tcPr>
+            <w:cnfStyle w:val="001000000000" w:firstRow="0" w:lastRow="0" w:firstColumn="1" w:lastColumn="0" w:oddVBand="0" w:evenVBand="0" w:oddHBand="0" w:evenHBand="0" w:firstRowFirstColumn="0" w:firstRowLastColumn="0" w:lastRowFirstColumn="0" w:lastRowLastColumn="0"/>
+            <w:tcW w:w="1213" w:type="dxa"/>
             <w:vAlign w:val="center"/>
           </w:tcPr>
           <w:p>
@@ -3604,8 +3710,7 @@
         </w:tc>
         <w:tc>
           <w:tcPr>
-            <w:tcW w:w="8032" w:type="dxa"/>
-            <w:vAlign w:val="center"/>
+            <w:tcW w:w="7804" w:type="dxa"/>
           </w:tcPr>
           <w:p>
             <w:pPr>
@@ -3614,6 +3719,9 @@
                 <w:rFonts w:ascii="Consolas" w:hAnsi="Consolas"/>
               </w:rPr>
             </w:pPr>
+            <w:r>
+              <w:t>material-usage-report.html</w:t>
+            </w:r>
           </w:p>
         </w:tc>
       </w:tr>
@@ -3624,7 +3732,7 @@
         <w:tc>
           <w:tcPr>
             <w:cnfStyle w:val="001000000000" w:firstRow="0" w:lastRow="0" w:firstColumn="1" w:lastColumn="0" w:oddVBand="0" w:evenVBand="0" w:oddHBand="0" w:evenHBand="0" w:firstRowFirstColumn="0" w:firstRowLastColumn="0" w:lastRowFirstColumn="0" w:lastRowLastColumn="0"/>
-            <w:tcW w:w="985" w:type="dxa"/>
+            <w:tcW w:w="1213" w:type="dxa"/>
             <w:vAlign w:val="center"/>
           </w:tcPr>
           <w:p>
@@ -3650,8 +3758,7 @@
         </w:tc>
         <w:tc>
           <w:tcPr>
-            <w:tcW w:w="8032" w:type="dxa"/>
-            <w:vAlign w:val="center"/>
+            <w:tcW w:w="7804" w:type="dxa"/>
           </w:tcPr>
           <w:p>
             <w:pPr>
@@ -3660,14 +3767,17 @@
                 <w:rFonts w:ascii="Consolas" w:hAnsi="Consolas"/>
               </w:rPr>
             </w:pPr>
-          </w:p>
-        </w:tc>
-      </w:tr>
-      <w:tr>
-        <w:tc>
-          <w:tcPr>
-            <w:cnfStyle w:val="001000000000" w:firstRow="0" w:lastRow="0" w:firstColumn="1" w:lastColumn="0" w:oddVBand="0" w:evenVBand="0" w:oddHBand="0" w:evenHBand="0" w:firstRowFirstColumn="0" w:firstRowLastColumn="0" w:lastRowFirstColumn="0" w:lastRowLastColumn="0"/>
-            <w:tcW w:w="985" w:type="dxa"/>
+            <w:r>
+              <w:t>customer-report.html</w:t>
+            </w:r>
+          </w:p>
+        </w:tc>
+      </w:tr>
+      <w:tr>
+        <w:tc>
+          <w:tcPr>
+            <w:cnfStyle w:val="001000000000" w:firstRow="0" w:lastRow="0" w:firstColumn="1" w:lastColumn="0" w:oddVBand="0" w:evenVBand="0" w:oddHBand="0" w:evenHBand="0" w:firstRowFirstColumn="0" w:firstRowLastColumn="0" w:lastRowFirstColumn="0" w:lastRowLastColumn="0"/>
+            <w:tcW w:w="1213" w:type="dxa"/>
             <w:vAlign w:val="center"/>
           </w:tcPr>
           <w:p>
@@ -3693,8 +3803,7 @@
         </w:tc>
         <w:tc>
           <w:tcPr>
-            <w:tcW w:w="8032" w:type="dxa"/>
-            <w:vAlign w:val="center"/>
+            <w:tcW w:w="7804" w:type="dxa"/>
           </w:tcPr>
           <w:p>
             <w:pPr>
@@ -3703,6 +3812,9 @@
                 <w:rFonts w:ascii="Consolas" w:hAnsi="Consolas"/>
               </w:rPr>
             </w:pPr>
+            <w:r>
+              <w:t>production-report.html</w:t>
+            </w:r>
           </w:p>
         </w:tc>
       </w:tr>
@@ -3713,7 +3825,7 @@
         <w:tc>
           <w:tcPr>
             <w:cnfStyle w:val="001000000000" w:firstRow="0" w:lastRow="0" w:firstColumn="1" w:lastColumn="0" w:oddVBand="0" w:evenVBand="0" w:oddHBand="0" w:evenHBand="0" w:firstRowFirstColumn="0" w:firstRowLastColumn="0" w:lastRowFirstColumn="0" w:lastRowLastColumn="0"/>
-            <w:tcW w:w="985" w:type="dxa"/>
+            <w:tcW w:w="1213" w:type="dxa"/>
             <w:vAlign w:val="center"/>
           </w:tcPr>
           <w:p>
@@ -3739,8 +3851,7 @@
         </w:tc>
         <w:tc>
           <w:tcPr>
-            <w:tcW w:w="8032" w:type="dxa"/>
-            <w:vAlign w:val="center"/>
+            <w:tcW w:w="7804" w:type="dxa"/>
           </w:tcPr>
           <w:p>
             <w:pPr>
@@ -3749,6 +3860,9 @@
                 <w:rFonts w:ascii="Consolas" w:hAnsi="Consolas"/>
               </w:rPr>
             </w:pPr>
+            <w:r>
+              <w:t>financial-report.html</w:t>
+            </w:r>
           </w:p>
         </w:tc>
       </w:tr>
@@ -3884,12 +3998,13 @@
                 <w:i/>
               </w:rPr>
             </w:pPr>
-          </w:p>
-        </w:tc>
-        <w:tc>
-          <w:tcPr>
-            <w:tcW w:w="7804" w:type="dxa"/>
-            <w:vAlign w:val="center"/>
+            <w:bookmarkStart w:id="0" w:name="_GoBack"/>
+            <w:bookmarkEnd w:id="0"/>
+          </w:p>
+        </w:tc>
+        <w:tc>
+          <w:tcPr>
+            <w:tcW w:w="7804" w:type="dxa"/>
           </w:tcPr>
           <w:p>
             <w:pPr>
@@ -3898,6 +4013,9 @@
                 <w:rFonts w:ascii="Consolas" w:hAnsi="Consolas"/>
               </w:rPr>
             </w:pPr>
+            <w:r>
+              <w:t>product-deactivate.html</w:t>
+            </w:r>
           </w:p>
         </w:tc>
       </w:tr>
@@ -3932,7 +4050,6 @@
         <w:tc>
           <w:tcPr>
             <w:tcW w:w="7804" w:type="dxa"/>
-            <w:vAlign w:val="center"/>
           </w:tcPr>
           <w:p>
             <w:pPr>
@@ -3941,6 +4058,9 @@
                 <w:rFonts w:ascii="Consolas" w:hAnsi="Consolas"/>
               </w:rPr>
             </w:pPr>
+            <w:r>
+              <w:t>product-archive.html</w:t>
+            </w:r>
           </w:p>
         </w:tc>
       </w:tr>
@@ -3978,7 +4098,6 @@
         <w:tc>
           <w:tcPr>
             <w:tcW w:w="7804" w:type="dxa"/>
-            <w:vAlign w:val="center"/>
           </w:tcPr>
           <w:p>
             <w:pPr>
@@ -3987,6 +4106,9 @@
                 <w:rFonts w:ascii="Consolas" w:hAnsi="Consolas"/>
               </w:rPr>
             </w:pPr>
+            <w:r>
+              <w:t>delete-confirmation.html</w:t>
+            </w:r>
           </w:p>
         </w:tc>
       </w:tr>
@@ -4021,7 +4143,6 @@
         <w:tc>
           <w:tcPr>
             <w:tcW w:w="7804" w:type="dxa"/>
-            <w:vAlign w:val="center"/>
           </w:tcPr>
           <w:p>
             <w:pPr>
@@ -4030,6 +4151,9 @@
                 <w:rFonts w:ascii="Consolas" w:hAnsi="Consolas"/>
               </w:rPr>
             </w:pPr>
+            <w:r>
+              <w:t>bulk-delete.html</w:t>
+            </w:r>
           </w:p>
         </w:tc>
       </w:tr>
@@ -4067,7 +4191,6 @@
         <w:tc>
           <w:tcPr>
             <w:tcW w:w="7804" w:type="dxa"/>
-            <w:vAlign w:val="center"/>
           </w:tcPr>
           <w:p>
             <w:pPr>
@@ -4076,6 +4199,9 @@
                 <w:rFonts w:ascii="Consolas" w:hAnsi="Consolas"/>
               </w:rPr>
             </w:pPr>
+            <w:r>
+              <w:t>product-replace.html</w:t>
+            </w:r>
           </w:p>
         </w:tc>
       </w:tr>
@@ -4110,7 +4236,6 @@
         <w:tc>
           <w:tcPr>
             <w:tcW w:w="7804" w:type="dxa"/>
-            <w:vAlign w:val="center"/>
           </w:tcPr>
           <w:p>
             <w:pPr>
@@ -4119,6 +4244,9 @@
                 <w:rFonts w:ascii="Consolas" w:hAnsi="Consolas"/>
               </w:rPr>
             </w:pPr>
+            <w:r>
+              <w:t>inventory-cleanup.html</w:t>
+            </w:r>
           </w:p>
         </w:tc>
       </w:tr>
@@ -4156,7 +4284,6 @@
         <w:tc>
           <w:tcPr>
             <w:tcW w:w="7804" w:type="dxa"/>
-            <w:vAlign w:val="center"/>
           </w:tcPr>
           <w:p>
             <w:pPr>
@@ -4165,6 +4292,9 @@
                 <w:rFonts w:ascii="Consolas" w:hAnsi="Consolas"/>
               </w:rPr>
             </w:pPr>
+            <w:r>
+              <w:t>deletion-history.html</w:t>
+            </w:r>
           </w:p>
         </w:tc>
       </w:tr>
@@ -4200,7 +4330,7 @@
 </file>
 
 <file path=word/endnotes.xml><?xml version="1.0" encoding="utf-8"?>
-<w:endnotes xmlns:wpc="http://schemas.microsoft.com/office/word/2010/wordprocessingCanvas" xmlns:cx="http://schemas.microsoft.com/office/drawing/2014/chartex" xmlns:cx1="http://schemas.microsoft.com/office/drawing/2015/9/8/chartex" xmlns:cx2="http://schemas.microsoft.com/office/drawing/2015/10/21/chartex" xmlns:cx3="http://schemas.microsoft.com/office/drawing/2016/5/9/chartex" xmlns:cx4="http://schemas.microsoft.com/office/drawing/2016/5/10/chartex" xmlns:cx5="http://schemas.microsoft.com/office/drawing/2016/5/11/chartex" xmlns:cx6="http://schemas.microsoft.com/office/drawing/2016/5/12/chartex" xmlns:cx7="http://schemas.microsoft.com/office/drawing/2016/5/13/chartex" xmlns:cx8="http://schemas.microsoft.com/office/drawing/2016/5/14/chartex" xmlns:mc="http://schemas.openxmlformats.org/markup-compatibility/2006" xmlns:aink="http://schemas.microsoft.com/office/drawing/2016/ink" xmlns:am3d="http://schemas.microsoft.com/office/drawing/2017/model3d" xmlns:o="urn:schemas-microsoft-com:office:office" xmlns:oel="http://schemas.microsoft.com/office/2019/extlst" xmlns:r="http://schemas.openxmlformats.org/officeDocument/2006/relationships" xmlns:m="http://schemas.openxmlformats.org/officeDocument/2006/math" xmlns:v="urn:schemas-microsoft-com:vml" xmlns:wp14="http://schemas.microsoft.com/office/word/2010/wordprocessingDrawing" xmlns:wp="http://schemas.openxmlformats.org/drawingml/2006/wordprocessingDrawing" xmlns:w10="urn:schemas-microsoft-com:office:word" xmlns:w="http://schemas.openxmlformats.org/wordprocessingml/2006/main" xmlns:w14="http://schemas.microsoft.com/office/word/2010/wordml" xmlns:w15="http://schemas.microsoft.com/office/word/2012/wordml" xmlns:w16cex="http://schemas.microsoft.com/office/word/2018/wordml/cex" xmlns:w16cid="http://schemas.microsoft.com/office/word/2016/wordml/cid" xmlns:w16="http://schemas.microsoft.com/office/word/2018/wordml" xmlns:w16sdtdh="http://schemas.microsoft.com/office/word/2020/wordml/sdtdatahash" xmlns:w16se="http://schemas.microsoft.com/office/word/2015/wordml/symex" xmlns:wpg="http://schemas.microsoft.com/office/word/2010/wordprocessingGroup" xmlns:wpi="http://schemas.microsoft.com/office/word/2010/wordprocessingInk" xmlns:wne="http://schemas.microsoft.com/office/word/2006/wordml" xmlns:wps="http://schemas.microsoft.com/office/word/2010/wordprocessingShape" mc:Ignorable="w14 w15 w16se w16cid w16 w16cex w16sdtdh wp14">
+<w:endnotes xmlns:wpc="http://schemas.microsoft.com/office/word/2010/wordprocessingCanvas" xmlns:cx="http://schemas.microsoft.com/office/drawing/2014/chartex" xmlns:cx1="http://schemas.microsoft.com/office/drawing/2015/9/8/chartex" xmlns:cx2="http://schemas.microsoft.com/office/drawing/2015/10/21/chartex" xmlns:cx3="http://schemas.microsoft.com/office/drawing/2016/5/9/chartex" xmlns:cx4="http://schemas.microsoft.com/office/drawing/2016/5/10/chartex" xmlns:cx5="http://schemas.microsoft.com/office/drawing/2016/5/11/chartex" xmlns:cx6="http://schemas.microsoft.com/office/drawing/2016/5/12/chartex" xmlns:cx7="http://schemas.microsoft.com/office/drawing/2016/5/13/chartex" xmlns:cx8="http://schemas.microsoft.com/office/drawing/2016/5/14/chartex" xmlns:mc="http://schemas.openxmlformats.org/markup-compatibility/2006" xmlns:aink="http://schemas.microsoft.com/office/drawing/2016/ink" xmlns:am3d="http://schemas.microsoft.com/office/drawing/2017/model3d" xmlns:o="urn:schemas-microsoft-com:office:office" xmlns:r="http://schemas.openxmlformats.org/officeDocument/2006/relationships" xmlns:m="http://schemas.openxmlformats.org/officeDocument/2006/math" xmlns:v="urn:schemas-microsoft-com:vml" xmlns:wp14="http://schemas.microsoft.com/office/word/2010/wordprocessingDrawing" xmlns:wp="http://schemas.openxmlformats.org/drawingml/2006/wordprocessingDrawing" xmlns:w10="urn:schemas-microsoft-com:office:word" xmlns:w="http://schemas.openxmlformats.org/wordprocessingml/2006/main" xmlns:w14="http://schemas.microsoft.com/office/word/2010/wordml" xmlns:w15="http://schemas.microsoft.com/office/word/2012/wordml" xmlns:w16cid="http://schemas.microsoft.com/office/word/2016/wordml/cid" xmlns:w16se="http://schemas.microsoft.com/office/word/2015/wordml/symex" xmlns:wpg="http://schemas.microsoft.com/office/word/2010/wordprocessingGroup" xmlns:wpi="http://schemas.microsoft.com/office/word/2010/wordprocessingInk" xmlns:wne="http://schemas.microsoft.com/office/word/2006/wordml" xmlns:wps="http://schemas.microsoft.com/office/word/2010/wordprocessingShape" mc:Ignorable="w14 w15 w16se w16cid wp14">
   <w:endnote w:type="separator" w:id="-1">
     <w:p>
       <w:r>
@@ -4219,7 +4349,7 @@
 </file>
 
 <file path=word/footer1.xml><?xml version="1.0" encoding="utf-8"?>
-<w:ftr xmlns:wpc="http://schemas.microsoft.com/office/word/2010/wordprocessingCanvas" xmlns:cx="http://schemas.microsoft.com/office/drawing/2014/chartex" xmlns:cx1="http://schemas.microsoft.com/office/drawing/2015/9/8/chartex" xmlns:cx2="http://schemas.microsoft.com/office/drawing/2015/10/21/chartex" xmlns:cx3="http://schemas.microsoft.com/office/drawing/2016/5/9/chartex" xmlns:cx4="http://schemas.microsoft.com/office/drawing/2016/5/10/chartex" xmlns:cx5="http://schemas.microsoft.com/office/drawing/2016/5/11/chartex" xmlns:cx6="http://schemas.microsoft.com/office/drawing/2016/5/12/chartex" xmlns:cx7="http://schemas.microsoft.com/office/drawing/2016/5/13/chartex" xmlns:cx8="http://schemas.microsoft.com/office/drawing/2016/5/14/chartex" xmlns:mc="http://schemas.openxmlformats.org/markup-compatibility/2006" xmlns:aink="http://schemas.microsoft.com/office/drawing/2016/ink" xmlns:am3d="http://schemas.microsoft.com/office/drawing/2017/model3d" xmlns:o="urn:schemas-microsoft-com:office:office" xmlns:oel="http://schemas.microsoft.com/office/2019/extlst" xmlns:r="http://schemas.openxmlformats.org/officeDocument/2006/relationships" xmlns:m="http://schemas.openxmlformats.org/officeDocument/2006/math" xmlns:v="urn:schemas-microsoft-com:vml" xmlns:wp14="http://schemas.microsoft.com/office/word/2010/wordprocessingDrawing" xmlns:wp="http://schemas.openxmlformats.org/drawingml/2006/wordprocessingDrawing" xmlns:w10="urn:schemas-microsoft-com:office:word" xmlns:w="http://schemas.openxmlformats.org/wordprocessingml/2006/main" xmlns:w14="http://schemas.microsoft.com/office/word/2010/wordml" xmlns:w15="http://schemas.microsoft.com/office/word/2012/wordml" xmlns:w16cex="http://schemas.microsoft.com/office/word/2018/wordml/cex" xmlns:w16cid="http://schemas.microsoft.com/office/word/2016/wordml/cid" xmlns:w16="http://schemas.microsoft.com/office/word/2018/wordml" xmlns:w16sdtdh="http://schemas.microsoft.com/office/word/2020/wordml/sdtdatahash" xmlns:w16se="http://schemas.microsoft.com/office/word/2015/wordml/symex" xmlns:wpg="http://schemas.microsoft.com/office/word/2010/wordprocessingGroup" xmlns:wpi="http://schemas.microsoft.com/office/word/2010/wordprocessingInk" xmlns:wne="http://schemas.microsoft.com/office/word/2006/wordml" xmlns:wps="http://schemas.microsoft.com/office/word/2010/wordprocessingShape" mc:Ignorable="w14 w15 w16se w16cid w16 w16cex w16sdtdh wp14">
+<w:ftr xmlns:wpc="http://schemas.microsoft.com/office/word/2010/wordprocessingCanvas" xmlns:cx="http://schemas.microsoft.com/office/drawing/2014/chartex" xmlns:cx1="http://schemas.microsoft.com/office/drawing/2015/9/8/chartex" xmlns:cx2="http://schemas.microsoft.com/office/drawing/2015/10/21/chartex" xmlns:cx3="http://schemas.microsoft.com/office/drawing/2016/5/9/chartex" xmlns:cx4="http://schemas.microsoft.com/office/drawing/2016/5/10/chartex" xmlns:cx5="http://schemas.microsoft.com/office/drawing/2016/5/11/chartex" xmlns:cx6="http://schemas.microsoft.com/office/drawing/2016/5/12/chartex" xmlns:cx7="http://schemas.microsoft.com/office/drawing/2016/5/13/chartex" xmlns:cx8="http://schemas.microsoft.com/office/drawing/2016/5/14/chartex" xmlns:mc="http://schemas.openxmlformats.org/markup-compatibility/2006" xmlns:aink="http://schemas.microsoft.com/office/drawing/2016/ink" xmlns:am3d="http://schemas.microsoft.com/office/drawing/2017/model3d" xmlns:o="urn:schemas-microsoft-com:office:office" xmlns:r="http://schemas.openxmlformats.org/officeDocument/2006/relationships" xmlns:m="http://schemas.openxmlformats.org/officeDocument/2006/math" xmlns:v="urn:schemas-microsoft-com:vml" xmlns:wp14="http://schemas.microsoft.com/office/word/2010/wordprocessingDrawing" xmlns:wp="http://schemas.openxmlformats.org/drawingml/2006/wordprocessingDrawing" xmlns:w10="urn:schemas-microsoft-com:office:word" xmlns:w="http://schemas.openxmlformats.org/wordprocessingml/2006/main" xmlns:w14="http://schemas.microsoft.com/office/word/2010/wordml" xmlns:w15="http://schemas.microsoft.com/office/word/2012/wordml" xmlns:w16cid="http://schemas.microsoft.com/office/word/2016/wordml/cid" xmlns:w16se="http://schemas.microsoft.com/office/word/2015/wordml/symex" xmlns:wpg="http://schemas.microsoft.com/office/word/2010/wordprocessingGroup" xmlns:wpi="http://schemas.microsoft.com/office/word/2010/wordprocessingInk" xmlns:wne="http://schemas.microsoft.com/office/word/2006/wordml" xmlns:wps="http://schemas.microsoft.com/office/word/2010/wordprocessingShape" mc:Ignorable="w14 w15 w16se w16cid wp14">
   <w:p>
     <w:pPr>
       <w:pStyle w:val="Footer"/>
@@ -4229,7 +4359,7 @@
 </file>
 
 <file path=word/footer2.xml><?xml version="1.0" encoding="utf-8"?>
-<w:ftr xmlns:wpc="http://schemas.microsoft.com/office/word/2010/wordprocessingCanvas" xmlns:cx="http://schemas.microsoft.com/office/drawing/2014/chartex" xmlns:cx1="http://schemas.microsoft.com/office/drawing/2015/9/8/chartex" xmlns:cx2="http://schemas.microsoft.com/office/drawing/2015/10/21/chartex" xmlns:cx3="http://schemas.microsoft.com/office/drawing/2016/5/9/chartex" xmlns:cx4="http://schemas.microsoft.com/office/drawing/2016/5/10/chartex" xmlns:cx5="http://schemas.microsoft.com/office/drawing/2016/5/11/chartex" xmlns:cx6="http://schemas.microsoft.com/office/drawing/2016/5/12/chartex" xmlns:cx7="http://schemas.microsoft.com/office/drawing/2016/5/13/chartex" xmlns:cx8="http://schemas.microsoft.com/office/drawing/2016/5/14/chartex" xmlns:mc="http://schemas.openxmlformats.org/markup-compatibility/2006" xmlns:aink="http://schemas.microsoft.com/office/drawing/2016/ink" xmlns:am3d="http://schemas.microsoft.com/office/drawing/2017/model3d" xmlns:o="urn:schemas-microsoft-com:office:office" xmlns:oel="http://schemas.microsoft.com/office/2019/extlst" xmlns:r="http://schemas.openxmlformats.org/officeDocument/2006/relationships" xmlns:m="http://schemas.openxmlformats.org/officeDocument/2006/math" xmlns:v="urn:schemas-microsoft-com:vml" xmlns:wp14="http://schemas.microsoft.com/office/word/2010/wordprocessingDrawing" xmlns:wp="http://schemas.openxmlformats.org/drawingml/2006/wordprocessingDrawing" xmlns:w10="urn:schemas-microsoft-com:office:word" xmlns:w="http://schemas.openxmlformats.org/wordprocessingml/2006/main" xmlns:w14="http://schemas.microsoft.com/office/word/2010/wordml" xmlns:w15="http://schemas.microsoft.com/office/word/2012/wordml" xmlns:w16cex="http://schemas.microsoft.com/office/word/2018/wordml/cex" xmlns:w16cid="http://schemas.microsoft.com/office/word/2016/wordml/cid" xmlns:w16="http://schemas.microsoft.com/office/word/2018/wordml" xmlns:w16sdtdh="http://schemas.microsoft.com/office/word/2020/wordml/sdtdatahash" xmlns:w16se="http://schemas.microsoft.com/office/word/2015/wordml/symex" xmlns:wpg="http://schemas.microsoft.com/office/word/2010/wordprocessingGroup" xmlns:wpi="http://schemas.microsoft.com/office/word/2010/wordprocessingInk" xmlns:wne="http://schemas.microsoft.com/office/word/2006/wordml" xmlns:wps="http://schemas.microsoft.com/office/word/2010/wordprocessingShape" mc:Ignorable="w14 w15 w16se w16cid w16 w16cex w16sdtdh wp14">
+<w:ftr xmlns:wpc="http://schemas.microsoft.com/office/word/2010/wordprocessingCanvas" xmlns:cx="http://schemas.microsoft.com/office/drawing/2014/chartex" xmlns:cx1="http://schemas.microsoft.com/office/drawing/2015/9/8/chartex" xmlns:cx2="http://schemas.microsoft.com/office/drawing/2015/10/21/chartex" xmlns:cx3="http://schemas.microsoft.com/office/drawing/2016/5/9/chartex" xmlns:cx4="http://schemas.microsoft.com/office/drawing/2016/5/10/chartex" xmlns:cx5="http://schemas.microsoft.com/office/drawing/2016/5/11/chartex" xmlns:cx6="http://schemas.microsoft.com/office/drawing/2016/5/12/chartex" xmlns:cx7="http://schemas.microsoft.com/office/drawing/2016/5/13/chartex" xmlns:cx8="http://schemas.microsoft.com/office/drawing/2016/5/14/chartex" xmlns:mc="http://schemas.openxmlformats.org/markup-compatibility/2006" xmlns:aink="http://schemas.microsoft.com/office/drawing/2016/ink" xmlns:am3d="http://schemas.microsoft.com/office/drawing/2017/model3d" xmlns:o="urn:schemas-microsoft-com:office:office" xmlns:r="http://schemas.openxmlformats.org/officeDocument/2006/relationships" xmlns:m="http://schemas.openxmlformats.org/officeDocument/2006/math" xmlns:v="urn:schemas-microsoft-com:vml" xmlns:wp14="http://schemas.microsoft.com/office/word/2010/wordprocessingDrawing" xmlns:wp="http://schemas.openxmlformats.org/drawingml/2006/wordprocessingDrawing" xmlns:w10="urn:schemas-microsoft-com:office:word" xmlns:w="http://schemas.openxmlformats.org/wordprocessingml/2006/main" xmlns:w14="http://schemas.microsoft.com/office/word/2010/wordml" xmlns:w15="http://schemas.microsoft.com/office/word/2012/wordml" xmlns:w16cid="http://schemas.microsoft.com/office/word/2016/wordml/cid" xmlns:w16se="http://schemas.microsoft.com/office/word/2015/wordml/symex" xmlns:wpg="http://schemas.microsoft.com/office/word/2010/wordprocessingGroup" xmlns:wpi="http://schemas.microsoft.com/office/word/2010/wordprocessingInk" xmlns:wne="http://schemas.microsoft.com/office/word/2006/wordml" xmlns:wps="http://schemas.microsoft.com/office/word/2010/wordprocessingShape" mc:Ignorable="w14 w15 w16se w16cid wp14">
   <w:p>
     <w:pPr>
       <w:pStyle w:val="Footer"/>
@@ -4239,7 +4369,7 @@
 </file>
 
 <file path=word/footer3.xml><?xml version="1.0" encoding="utf-8"?>
-<w:ftr xmlns:wpc="http://schemas.microsoft.com/office/word/2010/wordprocessingCanvas" xmlns:cx="http://schemas.microsoft.com/office/drawing/2014/chartex" xmlns:cx1="http://schemas.microsoft.com/office/drawing/2015/9/8/chartex" xmlns:cx2="http://schemas.microsoft.com/office/drawing/2015/10/21/chartex" xmlns:cx3="http://schemas.microsoft.com/office/drawing/2016/5/9/chartex" xmlns:cx4="http://schemas.microsoft.com/office/drawing/2016/5/10/chartex" xmlns:cx5="http://schemas.microsoft.com/office/drawing/2016/5/11/chartex" xmlns:cx6="http://schemas.microsoft.com/office/drawing/2016/5/12/chartex" xmlns:cx7="http://schemas.microsoft.com/office/drawing/2016/5/13/chartex" xmlns:cx8="http://schemas.microsoft.com/office/drawing/2016/5/14/chartex" xmlns:mc="http://schemas.openxmlformats.org/markup-compatibility/2006" xmlns:aink="http://schemas.microsoft.com/office/drawing/2016/ink" xmlns:am3d="http://schemas.microsoft.com/office/drawing/2017/model3d" xmlns:o="urn:schemas-microsoft-com:office:office" xmlns:oel="http://schemas.microsoft.com/office/2019/extlst" xmlns:r="http://schemas.openxmlformats.org/officeDocument/2006/relationships" xmlns:m="http://schemas.openxmlformats.org/officeDocument/2006/math" xmlns:v="urn:schemas-microsoft-com:vml" xmlns:wp14="http://schemas.microsoft.com/office/word/2010/wordprocessingDrawing" xmlns:wp="http://schemas.openxmlformats.org/drawingml/2006/wordprocessingDrawing" xmlns:w10="urn:schemas-microsoft-com:office:word" xmlns:w="http://schemas.openxmlformats.org/wordprocessingml/2006/main" xmlns:w14="http://schemas.microsoft.com/office/word/2010/wordml" xmlns:w15="http://schemas.microsoft.com/office/word/2012/wordml" xmlns:w16cex="http://schemas.microsoft.com/office/word/2018/wordml/cex" xmlns:w16cid="http://schemas.microsoft.com/office/word/2016/wordml/cid" xmlns:w16="http://schemas.microsoft.com/office/word/2018/wordml" xmlns:w16sdtdh="http://schemas.microsoft.com/office/word/2020/wordml/sdtdatahash" xmlns:w16se="http://schemas.microsoft.com/office/word/2015/wordml/symex" xmlns:wpg="http://schemas.microsoft.com/office/word/2010/wordprocessingGroup" xmlns:wpi="http://schemas.microsoft.com/office/word/2010/wordprocessingInk" xmlns:wne="http://schemas.microsoft.com/office/word/2006/wordml" xmlns:wps="http://schemas.microsoft.com/office/word/2010/wordprocessingShape" mc:Ignorable="w14 w15 w16se w16cid w16 w16cex w16sdtdh wp14">
+<w:ftr xmlns:wpc="http://schemas.microsoft.com/office/word/2010/wordprocessingCanvas" xmlns:cx="http://schemas.microsoft.com/office/drawing/2014/chartex" xmlns:cx1="http://schemas.microsoft.com/office/drawing/2015/9/8/chartex" xmlns:cx2="http://schemas.microsoft.com/office/drawing/2015/10/21/chartex" xmlns:cx3="http://schemas.microsoft.com/office/drawing/2016/5/9/chartex" xmlns:cx4="http://schemas.microsoft.com/office/drawing/2016/5/10/chartex" xmlns:cx5="http://schemas.microsoft.com/office/drawing/2016/5/11/chartex" xmlns:cx6="http://schemas.microsoft.com/office/drawing/2016/5/12/chartex" xmlns:cx7="http://schemas.microsoft.com/office/drawing/2016/5/13/chartex" xmlns:cx8="http://schemas.microsoft.com/office/drawing/2016/5/14/chartex" xmlns:mc="http://schemas.openxmlformats.org/markup-compatibility/2006" xmlns:aink="http://schemas.microsoft.com/office/drawing/2016/ink" xmlns:am3d="http://schemas.microsoft.com/office/drawing/2017/model3d" xmlns:o="urn:schemas-microsoft-com:office:office" xmlns:r="http://schemas.openxmlformats.org/officeDocument/2006/relationships" xmlns:m="http://schemas.openxmlformats.org/officeDocument/2006/math" xmlns:v="urn:schemas-microsoft-com:vml" xmlns:wp14="http://schemas.microsoft.com/office/word/2010/wordprocessingDrawing" xmlns:wp="http://schemas.openxmlformats.org/drawingml/2006/wordprocessingDrawing" xmlns:w10="urn:schemas-microsoft-com:office:word" xmlns:w="http://schemas.openxmlformats.org/wordprocessingml/2006/main" xmlns:w14="http://schemas.microsoft.com/office/word/2010/wordml" xmlns:w15="http://schemas.microsoft.com/office/word/2012/wordml" xmlns:w16cid="http://schemas.microsoft.com/office/word/2016/wordml/cid" xmlns:w16se="http://schemas.microsoft.com/office/word/2015/wordml/symex" xmlns:wpg="http://schemas.microsoft.com/office/word/2010/wordprocessingGroup" xmlns:wpi="http://schemas.microsoft.com/office/word/2010/wordprocessingInk" xmlns:wne="http://schemas.microsoft.com/office/word/2006/wordml" xmlns:wps="http://schemas.microsoft.com/office/word/2010/wordprocessingShape" mc:Ignorable="w14 w15 w16se w16cid wp14">
   <w:p>
     <w:pPr>
       <w:pStyle w:val="Footer"/>
@@ -4249,7 +4379,7 @@
 </file>
 
 <file path=word/footnotes.xml><?xml version="1.0" encoding="utf-8"?>
-<w:footnotes xmlns:wpc="http://schemas.microsoft.com/office/word/2010/wordprocessingCanvas" xmlns:cx="http://schemas.microsoft.com/office/drawing/2014/chartex" xmlns:cx1="http://schemas.microsoft.com/office/drawing/2015/9/8/chartex" xmlns:cx2="http://schemas.microsoft.com/office/drawing/2015/10/21/chartex" xmlns:cx3="http://schemas.microsoft.com/office/drawing/2016/5/9/chartex" xmlns:cx4="http://schemas.microsoft.com/office/drawing/2016/5/10/chartex" xmlns:cx5="http://schemas.microsoft.com/office/drawing/2016/5/11/chartex" xmlns:cx6="http://schemas.microsoft.com/office/drawing/2016/5/12/chartex" xmlns:cx7="http://schemas.microsoft.com/office/drawing/2016/5/13/chartex" xmlns:cx8="http://schemas.microsoft.com/office/drawing/2016/5/14/chartex" xmlns:mc="http://schemas.openxmlformats.org/markup-compatibility/2006" xmlns:aink="http://schemas.microsoft.com/office/drawing/2016/ink" xmlns:am3d="http://schemas.microsoft.com/office/drawing/2017/model3d" xmlns:o="urn:schemas-microsoft-com:office:office" xmlns:oel="http://schemas.microsoft.com/office/2019/extlst" xmlns:r="http://schemas.openxmlformats.org/officeDocument/2006/relationships" xmlns:m="http://schemas.openxmlformats.org/officeDocument/2006/math" xmlns:v="urn:schemas-microsoft-com:vml" xmlns:wp14="http://schemas.microsoft.com/office/word/2010/wordprocessingDrawing" xmlns:wp="http://schemas.openxmlformats.org/drawingml/2006/wordprocessingDrawing" xmlns:w10="urn:schemas-microsoft-com:office:word" xmlns:w="http://schemas.openxmlformats.org/wordprocessingml/2006/main" xmlns:w14="http://schemas.microsoft.com/office/word/2010/wordml" xmlns:w15="http://schemas.microsoft.com/office/word/2012/wordml" xmlns:w16cex="http://schemas.microsoft.com/office/word/2018/wordml/cex" xmlns:w16cid="http://schemas.microsoft.com/office/word/2016/wordml/cid" xmlns:w16="http://schemas.microsoft.com/office/word/2018/wordml" xmlns:w16sdtdh="http://schemas.microsoft.com/office/word/2020/wordml/sdtdatahash" xmlns:w16se="http://schemas.microsoft.com/office/word/2015/wordml/symex" xmlns:wpg="http://schemas.microsoft.com/office/word/2010/wordprocessingGroup" xmlns:wpi="http://schemas.microsoft.com/office/word/2010/wordprocessingInk" xmlns:wne="http://schemas.microsoft.com/office/word/2006/wordml" xmlns:wps="http://schemas.microsoft.com/office/word/2010/wordprocessingShape" mc:Ignorable="w14 w15 w16se w16cid w16 w16cex w16sdtdh wp14">
+<w:footnotes xmlns:wpc="http://schemas.microsoft.com/office/word/2010/wordprocessingCanvas" xmlns:cx="http://schemas.microsoft.com/office/drawing/2014/chartex" xmlns:cx1="http://schemas.microsoft.com/office/drawing/2015/9/8/chartex" xmlns:cx2="http://schemas.microsoft.com/office/drawing/2015/10/21/chartex" xmlns:cx3="http://schemas.microsoft.com/office/drawing/2016/5/9/chartex" xmlns:cx4="http://schemas.microsoft.com/office/drawing/2016/5/10/chartex" xmlns:cx5="http://schemas.microsoft.com/office/drawing/2016/5/11/chartex" xmlns:cx6="http://schemas.microsoft.com/office/drawing/2016/5/12/chartex" xmlns:cx7="http://schemas.microsoft.com/office/drawing/2016/5/13/chartex" xmlns:cx8="http://schemas.microsoft.com/office/drawing/2016/5/14/chartex" xmlns:mc="http://schemas.openxmlformats.org/markup-compatibility/2006" xmlns:aink="http://schemas.microsoft.com/office/drawing/2016/ink" xmlns:am3d="http://schemas.microsoft.com/office/drawing/2017/model3d" xmlns:o="urn:schemas-microsoft-com:office:office" xmlns:r="http://schemas.openxmlformats.org/officeDocument/2006/relationships" xmlns:m="http://schemas.openxmlformats.org/officeDocument/2006/math" xmlns:v="urn:schemas-microsoft-com:vml" xmlns:wp14="http://schemas.microsoft.com/office/word/2010/wordprocessingDrawing" xmlns:wp="http://schemas.openxmlformats.org/drawingml/2006/wordprocessingDrawing" xmlns:w10="urn:schemas-microsoft-com:office:word" xmlns:w="http://schemas.openxmlformats.org/wordprocessingml/2006/main" xmlns:w14="http://schemas.microsoft.com/office/word/2010/wordml" xmlns:w15="http://schemas.microsoft.com/office/word/2012/wordml" xmlns:w16cid="http://schemas.microsoft.com/office/word/2016/wordml/cid" xmlns:w16se="http://schemas.microsoft.com/office/word/2015/wordml/symex" xmlns:wpg="http://schemas.microsoft.com/office/word/2010/wordprocessingGroup" xmlns:wpi="http://schemas.microsoft.com/office/word/2010/wordprocessingInk" xmlns:wne="http://schemas.microsoft.com/office/word/2006/wordml" xmlns:wps="http://schemas.microsoft.com/office/word/2010/wordprocessingShape" mc:Ignorable="w14 w15 w16se w16cid wp14">
   <w:footnote w:type="separator" w:id="-1">
     <w:p>
       <w:r>
@@ -4268,7 +4398,7 @@
 </file>
 
 <file path=word/header1.xml><?xml version="1.0" encoding="utf-8"?>
-<w:hdr xmlns:wpc="http://schemas.microsoft.com/office/word/2010/wordprocessingCanvas" xmlns:cx="http://schemas.microsoft.com/office/drawing/2014/chartex" xmlns:cx1="http://schemas.microsoft.com/office/drawing/2015/9/8/chartex" xmlns:cx2="http://schemas.microsoft.com/office/drawing/2015/10/21/chartex" xmlns:cx3="http://schemas.microsoft.com/office/drawing/2016/5/9/chartex" xmlns:cx4="http://schemas.microsoft.com/office/drawing/2016/5/10/chartex" xmlns:cx5="http://schemas.microsoft.com/office/drawing/2016/5/11/chartex" xmlns:cx6="http://schemas.microsoft.com/office/drawing/2016/5/12/chartex" xmlns:cx7="http://schemas.microsoft.com/office/drawing/2016/5/13/chartex" xmlns:cx8="http://schemas.microsoft.com/office/drawing/2016/5/14/chartex" xmlns:mc="http://schemas.openxmlformats.org/markup-compatibility/2006" xmlns:aink="http://schemas.microsoft.com/office/drawing/2016/ink" xmlns:am3d="http://schemas.microsoft.com/office/drawing/2017/model3d" xmlns:o="urn:schemas-microsoft-com:office:office" xmlns:oel="http://schemas.microsoft.com/office/2019/extlst" xmlns:r="http://schemas.openxmlformats.org/officeDocument/2006/relationships" xmlns:m="http://schemas.openxmlformats.org/officeDocument/2006/math" xmlns:v="urn:schemas-microsoft-com:vml" xmlns:wp14="http://schemas.microsoft.com/office/word/2010/wordprocessingDrawing" xmlns:wp="http://schemas.openxmlformats.org/drawingml/2006/wordprocessingDrawing" xmlns:w10="urn:schemas-microsoft-com:office:word" xmlns:w="http://schemas.openxmlformats.org/wordprocessingml/2006/main" xmlns:w14="http://schemas.microsoft.com/office/word/2010/wordml" xmlns:w15="http://schemas.microsoft.com/office/word/2012/wordml" xmlns:w16cex="http://schemas.microsoft.com/office/word/2018/wordml/cex" xmlns:w16cid="http://schemas.microsoft.com/office/word/2016/wordml/cid" xmlns:w16="http://schemas.microsoft.com/office/word/2018/wordml" xmlns:w16sdtdh="http://schemas.microsoft.com/office/word/2020/wordml/sdtdatahash" xmlns:w16se="http://schemas.microsoft.com/office/word/2015/wordml/symex" xmlns:wpg="http://schemas.microsoft.com/office/word/2010/wordprocessingGroup" xmlns:wpi="http://schemas.microsoft.com/office/word/2010/wordprocessingInk" xmlns:wne="http://schemas.microsoft.com/office/word/2006/wordml" xmlns:wps="http://schemas.microsoft.com/office/word/2010/wordprocessingShape" mc:Ignorable="w14 w15 w16se w16cid w16 w16cex w16sdtdh wp14">
+<w:hdr xmlns:wpc="http://schemas.microsoft.com/office/word/2010/wordprocessingCanvas" xmlns:cx="http://schemas.microsoft.com/office/drawing/2014/chartex" xmlns:cx1="http://schemas.microsoft.com/office/drawing/2015/9/8/chartex" xmlns:cx2="http://schemas.microsoft.com/office/drawing/2015/10/21/chartex" xmlns:cx3="http://schemas.microsoft.com/office/drawing/2016/5/9/chartex" xmlns:cx4="http://schemas.microsoft.com/office/drawing/2016/5/10/chartex" xmlns:cx5="http://schemas.microsoft.com/office/drawing/2016/5/11/chartex" xmlns:cx6="http://schemas.microsoft.com/office/drawing/2016/5/12/chartex" xmlns:cx7="http://schemas.microsoft.com/office/drawing/2016/5/13/chartex" xmlns:cx8="http://schemas.microsoft.com/office/drawing/2016/5/14/chartex" xmlns:mc="http://schemas.openxmlformats.org/markup-compatibility/2006" xmlns:aink="http://schemas.microsoft.com/office/drawing/2016/ink" xmlns:am3d="http://schemas.microsoft.com/office/drawing/2017/model3d" xmlns:o="urn:schemas-microsoft-com:office:office" xmlns:r="http://schemas.openxmlformats.org/officeDocument/2006/relationships" xmlns:m="http://schemas.openxmlformats.org/officeDocument/2006/math" xmlns:v="urn:schemas-microsoft-com:vml" xmlns:wp14="http://schemas.microsoft.com/office/word/2010/wordprocessingDrawing" xmlns:wp="http://schemas.openxmlformats.org/drawingml/2006/wordprocessingDrawing" xmlns:w10="urn:schemas-microsoft-com:office:word" xmlns:w="http://schemas.openxmlformats.org/wordprocessingml/2006/main" xmlns:w14="http://schemas.microsoft.com/office/word/2010/wordml" xmlns:w15="http://schemas.microsoft.com/office/word/2012/wordml" xmlns:w16cid="http://schemas.microsoft.com/office/word/2016/wordml/cid" xmlns:w16se="http://schemas.microsoft.com/office/word/2015/wordml/symex" xmlns:wpg="http://schemas.microsoft.com/office/word/2010/wordprocessingGroup" xmlns:wpi="http://schemas.microsoft.com/office/word/2010/wordprocessingInk" xmlns:wne="http://schemas.microsoft.com/office/word/2006/wordml" xmlns:wps="http://schemas.microsoft.com/office/word/2010/wordprocessingShape" mc:Ignorable="w14 w15 w16se w16cid wp14">
   <w:p>
     <w:pPr>
       <w:pStyle w:val="Header"/>
@@ -4278,7 +4408,7 @@
 </file>
 
 <file path=word/header2.xml><?xml version="1.0" encoding="utf-8"?>
-<w:hdr xmlns:wpc="http://schemas.microsoft.com/office/word/2010/wordprocessingCanvas" xmlns:cx="http://schemas.microsoft.com/office/drawing/2014/chartex" xmlns:cx1="http://schemas.microsoft.com/office/drawing/2015/9/8/chartex" xmlns:cx2="http://schemas.microsoft.com/office/drawing/2015/10/21/chartex" xmlns:cx3="http://schemas.microsoft.com/office/drawing/2016/5/9/chartex" xmlns:cx4="http://schemas.microsoft.com/office/drawing/2016/5/10/chartex" xmlns:cx5="http://schemas.microsoft.com/office/drawing/2016/5/11/chartex" xmlns:cx6="http://schemas.microsoft.com/office/drawing/2016/5/12/chartex" xmlns:cx7="http://schemas.microsoft.com/office/drawing/2016/5/13/chartex" xmlns:cx8="http://schemas.microsoft.com/office/drawing/2016/5/14/chartex" xmlns:mc="http://schemas.openxmlformats.org/markup-compatibility/2006" xmlns:aink="http://schemas.microsoft.com/office/drawing/2016/ink" xmlns:am3d="http://schemas.microsoft.com/office/drawing/2017/model3d" xmlns:o="urn:schemas-microsoft-com:office:office" xmlns:oel="http://schemas.microsoft.com/office/2019/extlst" xmlns:r="http://schemas.openxmlformats.org/officeDocument/2006/relationships" xmlns:m="http://schemas.openxmlformats.org/officeDocument/2006/math" xmlns:v="urn:schemas-microsoft-com:vml" xmlns:wp14="http://schemas.microsoft.com/office/word/2010/wordprocessingDrawing" xmlns:wp="http://schemas.openxmlformats.org/drawingml/2006/wordprocessingDrawing" xmlns:w10="urn:schemas-microsoft-com:office:word" xmlns:w="http://schemas.openxmlformats.org/wordprocessingml/2006/main" xmlns:w14="http://schemas.microsoft.com/office/word/2010/wordml" xmlns:w15="http://schemas.microsoft.com/office/word/2012/wordml" xmlns:w16cex="http://schemas.microsoft.com/office/word/2018/wordml/cex" xmlns:w16cid="http://schemas.microsoft.com/office/word/2016/wordml/cid" xmlns:w16="http://schemas.microsoft.com/office/word/2018/wordml" xmlns:w16sdtdh="http://schemas.microsoft.com/office/word/2020/wordml/sdtdatahash" xmlns:w16se="http://schemas.microsoft.com/office/word/2015/wordml/symex" xmlns:wpg="http://schemas.microsoft.com/office/word/2010/wordprocessingGroup" xmlns:wpi="http://schemas.microsoft.com/office/word/2010/wordprocessingInk" xmlns:wne="http://schemas.microsoft.com/office/word/2006/wordml" xmlns:wps="http://schemas.microsoft.com/office/word/2010/wordprocessingShape" mc:Ignorable="w14 w15 w16se w16cid w16 w16cex w16sdtdh wp14">
+<w:hdr xmlns:wpc="http://schemas.microsoft.com/office/word/2010/wordprocessingCanvas" xmlns:cx="http://schemas.microsoft.com/office/drawing/2014/chartex" xmlns:cx1="http://schemas.microsoft.com/office/drawing/2015/9/8/chartex" xmlns:cx2="http://schemas.microsoft.com/office/drawing/2015/10/21/chartex" xmlns:cx3="http://schemas.microsoft.com/office/drawing/2016/5/9/chartex" xmlns:cx4="http://schemas.microsoft.com/office/drawing/2016/5/10/chartex" xmlns:cx5="http://schemas.microsoft.com/office/drawing/2016/5/11/chartex" xmlns:cx6="http://schemas.microsoft.com/office/drawing/2016/5/12/chartex" xmlns:cx7="http://schemas.microsoft.com/office/drawing/2016/5/13/chartex" xmlns:cx8="http://schemas.microsoft.com/office/drawing/2016/5/14/chartex" xmlns:mc="http://schemas.openxmlformats.org/markup-compatibility/2006" xmlns:aink="http://schemas.microsoft.com/office/drawing/2016/ink" xmlns:am3d="http://schemas.microsoft.com/office/drawing/2017/model3d" xmlns:o="urn:schemas-microsoft-com:office:office" xmlns:r="http://schemas.openxmlformats.org/officeDocument/2006/relationships" xmlns:m="http://schemas.openxmlformats.org/officeDocument/2006/math" xmlns:v="urn:schemas-microsoft-com:vml" xmlns:wp14="http://schemas.microsoft.com/office/word/2010/wordprocessingDrawing" xmlns:wp="http://schemas.openxmlformats.org/drawingml/2006/wordprocessingDrawing" xmlns:w10="urn:schemas-microsoft-com:office:word" xmlns:w="http://schemas.openxmlformats.org/wordprocessingml/2006/main" xmlns:w14="http://schemas.microsoft.com/office/word/2010/wordml" xmlns:w15="http://schemas.microsoft.com/office/word/2012/wordml" xmlns:w16cid="http://schemas.microsoft.com/office/word/2016/wordml/cid" xmlns:w16se="http://schemas.microsoft.com/office/word/2015/wordml/symex" xmlns:wpg="http://schemas.microsoft.com/office/word/2010/wordprocessingGroup" xmlns:wpi="http://schemas.microsoft.com/office/word/2010/wordprocessingInk" xmlns:wne="http://schemas.microsoft.com/office/word/2006/wordml" xmlns:wps="http://schemas.microsoft.com/office/word/2010/wordprocessingShape" mc:Ignorable="w14 w15 w16se w16cid wp14">
   <w:p>
     <w:pPr>
       <w:pStyle w:val="Header"/>
@@ -4288,7 +4418,7 @@
 </file>
 
 <file path=word/header3.xml><?xml version="1.0" encoding="utf-8"?>
-<w:hdr xmlns:wpc="http://schemas.microsoft.com/office/word/2010/wordprocessingCanvas" xmlns:cx="http://schemas.microsoft.com/office/drawing/2014/chartex" xmlns:cx1="http://schemas.microsoft.com/office/drawing/2015/9/8/chartex" xmlns:cx2="http://schemas.microsoft.com/office/drawing/2015/10/21/chartex" xmlns:cx3="http://schemas.microsoft.com/office/drawing/2016/5/9/chartex" xmlns:cx4="http://schemas.microsoft.com/office/drawing/2016/5/10/chartex" xmlns:cx5="http://schemas.microsoft.com/office/drawing/2016/5/11/chartex" xmlns:cx6="http://schemas.microsoft.com/office/drawing/2016/5/12/chartex" xmlns:cx7="http://schemas.microsoft.com/office/drawing/2016/5/13/chartex" xmlns:cx8="http://schemas.microsoft.com/office/drawing/2016/5/14/chartex" xmlns:mc="http://schemas.openxmlformats.org/markup-compatibility/2006" xmlns:aink="http://schemas.microsoft.com/office/drawing/2016/ink" xmlns:am3d="http://schemas.microsoft.com/office/drawing/2017/model3d" xmlns:o="urn:schemas-microsoft-com:office:office" xmlns:oel="http://schemas.microsoft.com/office/2019/extlst" xmlns:r="http://schemas.openxmlformats.org/officeDocument/2006/relationships" xmlns:m="http://schemas.openxmlformats.org/officeDocument/2006/math" xmlns:v="urn:schemas-microsoft-com:vml" xmlns:wp14="http://schemas.microsoft.com/office/word/2010/wordprocessingDrawing" xmlns:wp="http://schemas.openxmlformats.org/drawingml/2006/wordprocessingDrawing" xmlns:w10="urn:schemas-microsoft-com:office:word" xmlns:w="http://schemas.openxmlformats.org/wordprocessingml/2006/main" xmlns:w14="http://schemas.microsoft.com/office/word/2010/wordml" xmlns:w15="http://schemas.microsoft.com/office/word/2012/wordml" xmlns:w16cex="http://schemas.microsoft.com/office/word/2018/wordml/cex" xmlns:w16cid="http://schemas.microsoft.com/office/word/2016/wordml/cid" xmlns:w16="http://schemas.microsoft.com/office/word/2018/wordml" xmlns:w16sdtdh="http://schemas.microsoft.com/office/word/2020/wordml/sdtdatahash" xmlns:w16se="http://schemas.microsoft.com/office/word/2015/wordml/symex" xmlns:wpg="http://schemas.microsoft.com/office/word/2010/wordprocessingGroup" xmlns:wpi="http://schemas.microsoft.com/office/word/2010/wordprocessingInk" xmlns:wne="http://schemas.microsoft.com/office/word/2006/wordml" xmlns:wps="http://schemas.microsoft.com/office/word/2010/wordprocessingShape" mc:Ignorable="w14 w15 w16se w16cid w16 w16cex w16sdtdh wp14">
+<w:hdr xmlns:wpc="http://schemas.microsoft.com/office/word/2010/wordprocessingCanvas" xmlns:cx="http://schemas.microsoft.com/office/drawing/2014/chartex" xmlns:cx1="http://schemas.microsoft.com/office/drawing/2015/9/8/chartex" xmlns:cx2="http://schemas.microsoft.com/office/drawing/2015/10/21/chartex" xmlns:cx3="http://schemas.microsoft.com/office/drawing/2016/5/9/chartex" xmlns:cx4="http://schemas.microsoft.com/office/drawing/2016/5/10/chartex" xmlns:cx5="http://schemas.microsoft.com/office/drawing/2016/5/11/chartex" xmlns:cx6="http://schemas.microsoft.com/office/drawing/2016/5/12/chartex" xmlns:cx7="http://schemas.microsoft.com/office/drawing/2016/5/13/chartex" xmlns:cx8="http://schemas.microsoft.com/office/drawing/2016/5/14/chartex" xmlns:mc="http://schemas.openxmlformats.org/markup-compatibility/2006" xmlns:aink="http://schemas.microsoft.com/office/drawing/2016/ink" xmlns:am3d="http://schemas.microsoft.com/office/drawing/2017/model3d" xmlns:o="urn:schemas-microsoft-com:office:office" xmlns:r="http://schemas.openxmlformats.org/officeDocument/2006/relationships" xmlns:m="http://schemas.openxmlformats.org/officeDocument/2006/math" xmlns:v="urn:schemas-microsoft-com:vml" xmlns:wp14="http://schemas.microsoft.com/office/word/2010/wordprocessingDrawing" xmlns:wp="http://schemas.openxmlformats.org/drawingml/2006/wordprocessingDrawing" xmlns:w10="urn:schemas-microsoft-com:office:word" xmlns:w="http://schemas.openxmlformats.org/wordprocessingml/2006/main" xmlns:w14="http://schemas.microsoft.com/office/word/2010/wordml" xmlns:w15="http://schemas.microsoft.com/office/word/2012/wordml" xmlns:w16cid="http://schemas.microsoft.com/office/word/2016/wordml/cid" xmlns:w16se="http://schemas.microsoft.com/office/word/2015/wordml/symex" xmlns:wpg="http://schemas.microsoft.com/office/word/2010/wordprocessingGroup" xmlns:wpi="http://schemas.microsoft.com/office/word/2010/wordprocessingInk" xmlns:wne="http://schemas.microsoft.com/office/word/2006/wordml" xmlns:wps="http://schemas.microsoft.com/office/word/2010/wordprocessingShape" mc:Ignorable="w14 w15 w16se w16cid wp14">
   <w:p>
     <w:pPr>
       <w:pStyle w:val="Header"/>
@@ -4298,7 +4428,7 @@
 </file>
 
 <file path=word/numbering.xml><?xml version="1.0" encoding="utf-8"?>
-<w:numbering xmlns:wpc="http://schemas.microsoft.com/office/word/2010/wordprocessingCanvas" xmlns:cx="http://schemas.microsoft.com/office/drawing/2014/chartex" xmlns:cx1="http://schemas.microsoft.com/office/drawing/2015/9/8/chartex" xmlns:cx2="http://schemas.microsoft.com/office/drawing/2015/10/21/chartex" xmlns:cx3="http://schemas.microsoft.com/office/drawing/2016/5/9/chartex" xmlns:cx4="http://schemas.microsoft.com/office/drawing/2016/5/10/chartex" xmlns:cx5="http://schemas.microsoft.com/office/drawing/2016/5/11/chartex" xmlns:cx6="http://schemas.microsoft.com/office/drawing/2016/5/12/chartex" xmlns:cx7="http://schemas.microsoft.com/office/drawing/2016/5/13/chartex" xmlns:cx8="http://schemas.microsoft.com/office/drawing/2016/5/14/chartex" xmlns:mc="http://schemas.openxmlformats.org/markup-compatibility/2006" xmlns:aink="http://schemas.microsoft.com/office/drawing/2016/ink" xmlns:am3d="http://schemas.microsoft.com/office/drawing/2017/model3d" xmlns:o="urn:schemas-microsoft-com:office:office" xmlns:oel="http://schemas.microsoft.com/office/2019/extlst" xmlns:r="http://schemas.openxmlformats.org/officeDocument/2006/relationships" xmlns:m="http://schemas.openxmlformats.org/officeDocument/2006/math" xmlns:v="urn:schemas-microsoft-com:vml" xmlns:wp14="http://schemas.microsoft.com/office/word/2010/wordprocessingDrawing" xmlns:wp="http://schemas.openxmlformats.org/drawingml/2006/wordprocessingDrawing" xmlns:w10="urn:schemas-microsoft-com:office:word" xmlns:w="http://schemas.openxmlformats.org/wordprocessingml/2006/main" xmlns:w14="http://schemas.microsoft.com/office/word/2010/wordml" xmlns:w15="http://schemas.microsoft.com/office/word/2012/wordml" xmlns:w16cex="http://schemas.microsoft.com/office/word/2018/wordml/cex" xmlns:w16cid="http://schemas.microsoft.com/office/word/2016/wordml/cid" xmlns:w16="http://schemas.microsoft.com/office/word/2018/wordml" xmlns:w16sdtdh="http://schemas.microsoft.com/office/word/2020/wordml/sdtdatahash" xmlns:w16se="http://schemas.microsoft.com/office/word/2015/wordml/symex" xmlns:wpg="http://schemas.microsoft.com/office/word/2010/wordprocessingGroup" xmlns:wpi="http://schemas.microsoft.com/office/word/2010/wordprocessingInk" xmlns:wne="http://schemas.microsoft.com/office/word/2006/wordml" xmlns:wps="http://schemas.microsoft.com/office/word/2010/wordprocessingShape" mc:Ignorable="w14 w15 w16se w16cid w16 w16cex w16sdtdh wp14">
+<w:numbering xmlns:wpc="http://schemas.microsoft.com/office/word/2010/wordprocessingCanvas" xmlns:cx="http://schemas.microsoft.com/office/drawing/2014/chartex" xmlns:cx1="http://schemas.microsoft.com/office/drawing/2015/9/8/chartex" xmlns:cx2="http://schemas.microsoft.com/office/drawing/2015/10/21/chartex" xmlns:cx3="http://schemas.microsoft.com/office/drawing/2016/5/9/chartex" xmlns:cx4="http://schemas.microsoft.com/office/drawing/2016/5/10/chartex" xmlns:cx5="http://schemas.microsoft.com/office/drawing/2016/5/11/chartex" xmlns:cx6="http://schemas.microsoft.com/office/drawing/2016/5/12/chartex" xmlns:cx7="http://schemas.microsoft.com/office/drawing/2016/5/13/chartex" xmlns:cx8="http://schemas.microsoft.com/office/drawing/2016/5/14/chartex" xmlns:mc="http://schemas.openxmlformats.org/markup-compatibility/2006" xmlns:aink="http://schemas.microsoft.com/office/drawing/2016/ink" xmlns:am3d="http://schemas.microsoft.com/office/drawing/2017/model3d" xmlns:o="urn:schemas-microsoft-com:office:office" xmlns:r="http://schemas.openxmlformats.org/officeDocument/2006/relationships" xmlns:m="http://schemas.openxmlformats.org/officeDocument/2006/math" xmlns:v="urn:schemas-microsoft-com:vml" xmlns:wp14="http://schemas.microsoft.com/office/word/2010/wordprocessingDrawing" xmlns:wp="http://schemas.openxmlformats.org/drawingml/2006/wordprocessingDrawing" xmlns:w10="urn:schemas-microsoft-com:office:word" xmlns:w="http://schemas.openxmlformats.org/wordprocessingml/2006/main" xmlns:w14="http://schemas.microsoft.com/office/word/2010/wordml" xmlns:w15="http://schemas.microsoft.com/office/word/2012/wordml" xmlns:w16cid="http://schemas.microsoft.com/office/word/2016/wordml/cid" xmlns:w16se="http://schemas.microsoft.com/office/word/2015/wordml/symex" xmlns:wpg="http://schemas.microsoft.com/office/word/2010/wordprocessingGroup" xmlns:wpi="http://schemas.microsoft.com/office/word/2010/wordprocessingInk" xmlns:wne="http://schemas.microsoft.com/office/word/2006/wordml" xmlns:wps="http://schemas.microsoft.com/office/word/2010/wordprocessingShape" mc:Ignorable="w14 w15 w16se w16cid wp14">
   <w:abstractNum w:abstractNumId="0" w15:restartNumberingAfterBreak="0">
     <w:nsid w:val="01A43051"/>
     <w:multiLevelType w:val="hybridMultilevel"/>
@@ -5278,44 +5408,44 @@
       </w:pPr>
     </w:lvl>
   </w:abstractNum>
-  <w:num w:numId="1" w16cid:durableId="623579463">
+  <w:num w:numId="1">
     <w:abstractNumId w:val="6"/>
   </w:num>
-  <w:num w:numId="2" w16cid:durableId="653879682">
+  <w:num w:numId="2">
     <w:abstractNumId w:val="4"/>
   </w:num>
-  <w:num w:numId="3" w16cid:durableId="1015812609">
+  <w:num w:numId="3">
     <w:abstractNumId w:val="5"/>
   </w:num>
-  <w:num w:numId="4" w16cid:durableId="2033453563">
+  <w:num w:numId="4">
     <w:abstractNumId w:val="1"/>
   </w:num>
-  <w:num w:numId="5" w16cid:durableId="724715672">
+  <w:num w:numId="5">
     <w:abstractNumId w:val="0"/>
   </w:num>
-  <w:num w:numId="6" w16cid:durableId="855312400">
+  <w:num w:numId="6">
     <w:abstractNumId w:val="3"/>
   </w:num>
-  <w:num w:numId="7" w16cid:durableId="1933972730">
+  <w:num w:numId="7">
     <w:abstractNumId w:val="7"/>
   </w:num>
-  <w:num w:numId="8" w16cid:durableId="1457528650">
+  <w:num w:numId="8">
     <w:abstractNumId w:val="10"/>
   </w:num>
-  <w:num w:numId="9" w16cid:durableId="155193811">
+  <w:num w:numId="9">
     <w:abstractNumId w:val="9"/>
   </w:num>
-  <w:num w:numId="10" w16cid:durableId="904531775">
+  <w:num w:numId="10">
     <w:abstractNumId w:val="8"/>
   </w:num>
-  <w:num w:numId="11" w16cid:durableId="134372050">
+  <w:num w:numId="11">
     <w:abstractNumId w:val="2"/>
   </w:num>
 </w:numbering>
 </file>
 
 <file path=word/styles.xml><?xml version="1.0" encoding="utf-8"?>
-<w:styles xmlns:mc="http://schemas.openxmlformats.org/markup-compatibility/2006" xmlns:r="http://schemas.openxmlformats.org/officeDocument/2006/relationships" xmlns:w="http://schemas.openxmlformats.org/wordprocessingml/2006/main" xmlns:w14="http://schemas.microsoft.com/office/word/2010/wordml" xmlns:w15="http://schemas.microsoft.com/office/word/2012/wordml" xmlns:w16cex="http://schemas.microsoft.com/office/word/2018/wordml/cex" xmlns:w16cid="http://schemas.microsoft.com/office/word/2016/wordml/cid" xmlns:w16="http://schemas.microsoft.com/office/word/2018/wordml" xmlns:w16sdtdh="http://schemas.microsoft.com/office/word/2020/wordml/sdtdatahash" xmlns:w16se="http://schemas.microsoft.com/office/word/2015/wordml/symex" mc:Ignorable="w14 w15 w16se w16cid w16 w16cex w16sdtdh">
+<w:styles xmlns:mc="http://schemas.openxmlformats.org/markup-compatibility/2006" xmlns:r="http://schemas.openxmlformats.org/officeDocument/2006/relationships" xmlns:w="http://schemas.openxmlformats.org/wordprocessingml/2006/main" xmlns:w14="http://schemas.microsoft.com/office/word/2010/wordml" xmlns:w15="http://schemas.microsoft.com/office/word/2012/wordml" xmlns:w16cid="http://schemas.microsoft.com/office/word/2016/wordml/cid" xmlns:w16se="http://schemas.microsoft.com/office/word/2015/wordml/symex" mc:Ignorable="w14 w15 w16se w16cid">
   <w:docDefaults>
     <w:rPrDefault>
       <w:rPr>
@@ -5331,7 +5461,7 @@
       </w:pPr>
     </w:pPrDefault>
   </w:docDefaults>
-  <w:latentStyles w:defLockedState="0" w:defUIPriority="99" w:defSemiHidden="0" w:defUnhideWhenUsed="0" w:defQFormat="0" w:count="376">
+  <w:latentStyles w:defLockedState="0" w:defUIPriority="99" w:defSemiHidden="0" w:defUnhideWhenUsed="0" w:defQFormat="0" w:count="375">
     <w:lsdException w:name="Normal" w:uiPriority="0" w:qFormat="1"/>
     <w:lsdException w:name="heading 1" w:uiPriority="9" w:qFormat="1"/>
     <w:lsdException w:name="heading 2" w:semiHidden="1" w:uiPriority="9" w:unhideWhenUsed="1" w:qFormat="1"/>
@@ -5707,7 +5837,6 @@
     <w:lsdException w:name="Smart Hyperlink" w:semiHidden="1" w:unhideWhenUsed="1"/>
     <w:lsdException w:name="Hashtag" w:semiHidden="1" w:unhideWhenUsed="1"/>
     <w:lsdException w:name="Unresolved Mention" w:semiHidden="1" w:unhideWhenUsed="1"/>
-    <w:lsdException w:name="Smart Link" w:semiHidden="1" w:unhideWhenUsed="1"/>
   </w:latentStyles>
   <w:style w:type="paragraph" w:default="1" w:styleId="Normal">
     <w:name w:val="Normal"/>

</xml_diff>